<commit_message>
SPDA: NG da tabela municipal do Anexo F (Mato Grosso do Sul)
- 79 municípios de MS com NG da ABNT NBR 5419-2:2026, Anexo F;
  escolha do município preenche o NG e a fonte no memorial.
- Memorial do SPDA com anexo opcional reproduzindo a tabela do estado
  e o município adotado; tabela também em Tabelas › SPDA.
- Exemplo em Campo Grande (NG = 30); testes do motor.

Co-Authored-By: Claude Opus 5.5 <noreply@anthropic.com>
Claude-Session: https://claude.ai/code/session_01E4Px4gvzC9MkKBX1rn21ys
</commit_message>
<xml_diff>
--- a/exemplo/memorial-spda-residencia-unifamiliar-exemplo-r00.docx
+++ b/exemplo/memorial-spda-residencia-unifamiliar-exemplo-r00.docx
@@ -926,7 +926,7 @@
                 <w:szCs w:val="17"/>
                 <w:rFonts w:ascii="Calibri" w:cs="Calibri" w:eastAsia="Calibri" w:hAnsi="Calibri"/>
               </w:rPr>
-              <w:t xml:space="preserve">10,00 descargas/km²/ano — valor ilustrativo — substitua pelo NG do Anexo F da NBR 5419-2:2026 para o município</w:t>
+              <w:t xml:space="preserve">30 descargas/km²/ano — ABNT NBR 5419-2:2026, Anexo F — Campo Grande/MS</w:t>
             </w:r>
           </w:p>
         </w:tc>
@@ -2038,7 +2038,7 @@
           <w:szCs w:val="17"/>
           <w:rFonts w:ascii="Consolas" w:cs="Consolas" w:eastAsia="Consolas" w:hAnsi="Consolas"/>
         </w:rPr>
-        <w:t xml:space="preserve">AD = L × W + 2 × (3H) × (L + W) + π × (3H)² = 1.734 m²;   ND = NG × AD × CD × 10⁻⁶ = 10,00 × 1.734 × 0,5 × 10⁻⁶ = 0,0087 /ano</w:t>
+        <w:t xml:space="preserve">AD = L × W + 2 × (3H) × (L + W) + π × (3H)² = 1.734 m²;   ND = NG × AD × CD × 10⁻⁶ = 30 × 1.734 × 0,5 × 10⁻⁶ = 0,0260 /ano</w:t>
       </w:r>
     </w:p>
     <w:p>
@@ -2054,7 +2054,7 @@
           <w:szCs w:val="17"/>
           <w:rFonts w:ascii="Consolas" w:cs="Consolas" w:eastAsia="Consolas" w:hAnsi="Consolas"/>
         </w:rPr>
-        <w:t xml:space="preserve">AM = 2 × 500 × (L + W) + π × 500² = 808.398 m²;   NM = NG × AM × 10⁻⁶ = 8,084 /ano</w:t>
+        <w:t xml:space="preserve">AM = 2 × 500 × (L + W) + π × 500² = 808.398 m²;   NM = NG × AM × 10⁻⁶ = 24,252 /ano</w:t>
       </w:r>
     </w:p>
     <w:p>
@@ -2070,7 +2070,7 @@
           <w:szCs w:val="17"/>
           <w:rFonts w:ascii="Consolas" w:cs="Consolas" w:eastAsia="Consolas" w:hAnsi="Consolas"/>
         </w:rPr>
-        <w:t xml:space="preserve">Linha de energia: AL = 40 × LL = 40.000 m²; NL = NG × AL × CI × CE × CT × 10⁻⁶ = 0,0400 /ano; AI = 4 000 × LL; NI = 4,000 /ano</w:t>
+        <w:t xml:space="preserve">Linha de energia: AL = 40 × LL = 40.000 m²; NL = NG × AL × CI × CE × CT × 10⁻⁶ = 0,1200 /ano; AI = 4 000 × LL; NI = 12,000 /ano</w:t>
       </w:r>
     </w:p>
     <w:p>
@@ -2086,7 +2086,7 @@
           <w:szCs w:val="17"/>
           <w:rFonts w:ascii="Consolas" w:cs="Consolas" w:eastAsia="Consolas" w:hAnsi="Consolas"/>
         </w:rPr>
-        <w:t xml:space="preserve">Linha de telecomunicações: AL = 40 × LL = 40.000 m²; NL = NG × AL × CI × CE × CT × 10⁻⁶ = 0,0400 /ano; AI = 4 000 × LL; NI = 4,000 /ano</w:t>
+        <w:t xml:space="preserve">Linha de telecomunicações: AL = 40 × LL = 40.000 m²; NL = NG × AL × CI × CE × CT × 10⁻⁶ = 0,1200 /ano; AI = 4 000 × LL; NI = 12,000 /ano</w:t>
       </w:r>
     </w:p>
     <w:p>
@@ -2437,7 +2437,7 @@
                 <w:szCs w:val="15"/>
                 <w:rFonts w:ascii="Calibri" w:cs="Calibri" w:eastAsia="Calibri" w:hAnsi="Calibri"/>
               </w:rPr>
-              <w:t xml:space="preserve">0,009 × 10⁻⁵</w:t>
+              <w:t xml:space="preserve">0,026 × 10⁻⁵</w:t>
             </w:r>
           </w:p>
         </w:tc>
@@ -2461,7 +2461,7 @@
                 <w:szCs w:val="15"/>
                 <w:rFonts w:ascii="Calibri" w:cs="Calibri" w:eastAsia="Calibri" w:hAnsi="Calibri"/>
               </w:rPr>
-              <w:t xml:space="preserve">0,001 × 10⁻⁵</w:t>
+              <w:t xml:space="preserve">0,003 × 10⁻⁵</w:t>
             </w:r>
           </w:p>
         </w:tc>
@@ -2562,7 +2562,7 @@
                 <w:szCs w:val="15"/>
                 <w:rFonts w:ascii="Calibri" w:cs="Calibri" w:eastAsia="Calibri" w:hAnsi="Calibri"/>
               </w:rPr>
-              <w:t xml:space="preserve">0,043 × 10⁻⁵</w:t>
+              <w:t xml:space="preserve">0,130 × 10⁻⁵</w:t>
             </w:r>
           </w:p>
         </w:tc>
@@ -2586,7 +2586,7 @@
                 <w:szCs w:val="15"/>
                 <w:rFonts w:ascii="Calibri" w:cs="Calibri" w:eastAsia="Calibri" w:hAnsi="Calibri"/>
               </w:rPr>
-              <w:t xml:space="preserve">0,004 × 10⁻⁵</w:t>
+              <w:t xml:space="preserve">0,013 × 10⁻⁵</w:t>
             </w:r>
           </w:p>
         </w:tc>
@@ -2687,7 +2687,7 @@
                 <w:szCs w:val="15"/>
                 <w:rFonts w:ascii="Calibri" w:cs="Calibri" w:eastAsia="Calibri" w:hAnsi="Calibri"/>
               </w:rPr>
-              <w:t xml:space="preserve">0,080 × 10⁻⁵</w:t>
+              <w:t xml:space="preserve">0,240 × 10⁻⁵</w:t>
             </w:r>
           </w:p>
         </w:tc>
@@ -2711,7 +2711,7 @@
                 <w:szCs w:val="15"/>
                 <w:rFonts w:ascii="Calibri" w:cs="Calibri" w:eastAsia="Calibri" w:hAnsi="Calibri"/>
               </w:rPr>
-              <w:t xml:space="preserve">0,004 × 10⁻⁵</w:t>
+              <w:t xml:space="preserve">0,012 × 10⁻⁵</w:t>
             </w:r>
           </w:p>
         </w:tc>
@@ -2812,7 +2812,7 @@
                 <w:szCs w:val="15"/>
                 <w:rFonts w:ascii="Calibri" w:cs="Calibri" w:eastAsia="Calibri" w:hAnsi="Calibri"/>
               </w:rPr>
-              <w:t xml:space="preserve">0,400 × 10⁻⁵</w:t>
+              <w:t xml:space="preserve">1,200 × 10⁻⁵</w:t>
             </w:r>
           </w:p>
         </w:tc>
@@ -2836,7 +2836,7 @@
                 <w:szCs w:val="15"/>
                 <w:rFonts w:ascii="Calibri" w:cs="Calibri" w:eastAsia="Calibri" w:hAnsi="Calibri"/>
               </w:rPr>
-              <w:t xml:space="preserve">0,020 × 10⁻⁵</w:t>
+              <w:t xml:space="preserve">0,060 × 10⁻⁵</w:t>
             </w:r>
           </w:p>
         </w:tc>
@@ -2937,7 +2937,7 @@
                 <w:szCs w:val="15"/>
                 <w:rFonts w:ascii="Calibri" w:cs="Calibri" w:eastAsia="Calibri" w:hAnsi="Calibri"/>
               </w:rPr>
-              <w:t xml:space="preserve">0,532 × 10⁻⁵</w:t>
+              <w:t xml:space="preserve">1,596 × 10⁻⁵</w:t>
             </w:r>
           </w:p>
         </w:tc>
@@ -2961,7 +2961,7 @@
                 <w:szCs w:val="15"/>
                 <w:rFonts w:ascii="Calibri" w:cs="Calibri" w:eastAsia="Calibri" w:hAnsi="Calibri"/>
               </w:rPr>
-              <w:t xml:space="preserve">0,029 × 10⁻⁵</w:t>
+              <w:t xml:space="preserve">0,088 × 10⁻⁵</w:t>
             </w:r>
           </w:p>
         </w:tc>
@@ -3215,7 +3215,7 @@
                 <w:szCs w:val="15"/>
                 <w:rFonts w:ascii="Calibri" w:cs="Calibri" w:eastAsia="Calibri" w:hAnsi="Calibri"/>
               </w:rPr>
-              <w:t xml:space="preserve">0,532 ✓</w:t>
+              <w:t xml:space="preserve">1,596</w:t>
             </w:r>
           </w:p>
         </w:tc>
@@ -3239,7 +3239,7 @@
                 <w:szCs w:val="15"/>
                 <w:rFonts w:ascii="Calibri" w:cs="Calibri" w:eastAsia="Calibri" w:hAnsi="Calibri"/>
               </w:rPr>
-              <w:t xml:space="preserve">0,076 ✓</w:t>
+              <w:t xml:space="preserve">0,228 ✓</w:t>
             </w:r>
           </w:p>
         </w:tc>
@@ -3263,7 +3263,7 @@
                 <w:szCs w:val="15"/>
                 <w:rFonts w:ascii="Calibri" w:cs="Calibri" w:eastAsia="Calibri" w:hAnsi="Calibri"/>
               </w:rPr>
-              <w:t xml:space="preserve">0,062 ✓</w:t>
+              <w:t xml:space="preserve">0,185 ✓</w:t>
             </w:r>
           </w:p>
         </w:tc>
@@ -3287,7 +3287,7 @@
                 <w:szCs w:val="15"/>
                 <w:rFonts w:ascii="Calibri" w:cs="Calibri" w:eastAsia="Calibri" w:hAnsi="Calibri"/>
               </w:rPr>
-              <w:t xml:space="preserve">0,057 ✓</w:t>
+              <w:t xml:space="preserve">0,170 ✓</w:t>
             </w:r>
           </w:p>
         </w:tc>
@@ -3364,7 +3364,7 @@
                 <w:szCs w:val="15"/>
                 <w:rFonts w:ascii="Calibri" w:cs="Calibri" w:eastAsia="Calibri" w:hAnsi="Calibri"/>
               </w:rPr>
-              <w:t xml:space="preserve">0,034 ✓</w:t>
+              <w:t xml:space="preserve">0,103 ✓</w:t>
             </w:r>
           </w:p>
         </w:tc>
@@ -3388,7 +3388,7 @@
                 <w:szCs w:val="15"/>
                 <w:rFonts w:ascii="Calibri" w:cs="Calibri" w:eastAsia="Calibri" w:hAnsi="Calibri"/>
               </w:rPr>
-              <w:t xml:space="preserve">0,020 ✓</w:t>
+              <w:t xml:space="preserve">0,060 ✓</w:t>
             </w:r>
           </w:p>
         </w:tc>
@@ -3412,7 +3412,7 @@
                 <w:szCs w:val="15"/>
                 <w:rFonts w:ascii="Calibri" w:cs="Calibri" w:eastAsia="Calibri" w:hAnsi="Calibri"/>
               </w:rPr>
-              <w:t xml:space="preserve">0,015 ✓</w:t>
+              <w:t xml:space="preserve">0,046 ✓</w:t>
             </w:r>
           </w:p>
         </w:tc>
@@ -3489,7 +3489,7 @@
                 <w:szCs w:val="15"/>
                 <w:rFonts w:ascii="Calibri" w:cs="Calibri" w:eastAsia="Calibri" w:hAnsi="Calibri"/>
               </w:rPr>
-              <w:t xml:space="preserve">0,029 ✓</w:t>
+              <w:t xml:space="preserve">0,088 ✓</w:t>
             </w:r>
           </w:p>
         </w:tc>
@@ -3513,7 +3513,7 @@
                 <w:szCs w:val="15"/>
                 <w:rFonts w:ascii="Calibri" w:cs="Calibri" w:eastAsia="Calibri" w:hAnsi="Calibri"/>
               </w:rPr>
-              <w:t xml:space="preserve">0,015 ✓</w:t>
+              <w:t xml:space="preserve">0,044 ✓</w:t>
             </w:r>
           </w:p>
         </w:tc>
@@ -3537,7 +3537,7 @@
                 <w:szCs w:val="15"/>
                 <w:rFonts w:ascii="Calibri" w:cs="Calibri" w:eastAsia="Calibri" w:hAnsi="Calibri"/>
               </w:rPr>
-              <w:t xml:space="preserve">0,010 ✓</w:t>
+              <w:t xml:space="preserve">0,030 ✓</w:t>
             </w:r>
           </w:p>
         </w:tc>
@@ -3638,7 +3638,7 @@
                 <w:szCs w:val="15"/>
                 <w:rFonts w:ascii="Calibri" w:cs="Calibri" w:eastAsia="Calibri" w:hAnsi="Calibri"/>
               </w:rPr>
-              <w:t xml:space="preserve">0,012 ✓</w:t>
+              <w:t xml:space="preserve">0,037 ✓</w:t>
             </w:r>
           </w:p>
         </w:tc>
@@ -3662,7 +3662,7 @@
                 <w:szCs w:val="15"/>
                 <w:rFonts w:ascii="Calibri" w:cs="Calibri" w:eastAsia="Calibri" w:hAnsi="Calibri"/>
               </w:rPr>
-              <w:t xml:space="preserve">0,007 ✓</w:t>
+              <w:t xml:space="preserve">0,022 ✓</w:t>
             </w:r>
           </w:p>
         </w:tc>
@@ -3787,7 +3787,7 @@
                 <w:szCs w:val="15"/>
                 <w:rFonts w:ascii="Calibri" w:cs="Calibri" w:eastAsia="Calibri" w:hAnsi="Calibri"/>
               </w:rPr>
-              <w:t xml:space="preserve">0,006 ✓</w:t>
+              <w:t xml:space="preserve">0,018 ✓</w:t>
             </w:r>
           </w:p>
         </w:tc>
@@ -3906,7 +3906,7 @@
           <w:szCs w:val="19"/>
           <w:rFonts w:ascii="Calibri" w:cs="Calibri" w:eastAsia="Calibri" w:hAnsi="Calibri"/>
         </w:rPr>
-        <w:t xml:space="preserve">✓ R1 = 0,029 × 10⁻⁵ ≤ RT = 1 × 10⁻⁵ (perda de vida humana)</w:t>
+        <w:t xml:space="preserve">✓ R1 = 0,088 × 10⁻⁵ ≤ RT = 1 × 10⁻⁵ (perda de vida humana)</w:t>
       </w:r>
     </w:p>
     <w:p>
@@ -3920,7 +3920,7 @@
           <w:szCs w:val="19"/>
           <w:rFonts w:ascii="Calibri" w:cs="Calibri" w:eastAsia="Calibri" w:hAnsi="Calibri"/>
         </w:rPr>
-        <w:t xml:space="preserve">✓ Frequência de danos F = FC + FM + FW + FZ = 0,1857 /ano ≤ FT = 1,0 /ano (sistemas internos)</w:t>
+        <w:t xml:space="preserve">✓ Frequência de danos F = FC + FM + FW + FZ = 0,5570 /ano ≤ FT = 1,0 /ano (sistemas internos)</w:t>
       </w:r>
     </w:p>
     <w:p>
@@ -3933,7 +3933,7 @@
           <w:szCs w:val="20"/>
           <w:rFonts w:ascii="Calibri" w:cs="Calibri" w:eastAsia="Calibri" w:hAnsi="Calibri"/>
         </w:rPr>
-        <w:t xml:space="preserve">Sem SPDA e sem DPS coordenados, o risco R1 atende ao tolerável. O SPDA NP III é adotado por opção do projeto (proteção do patrimônio ou exigência de outra regulamentação).</w:t>
+        <w:t xml:space="preserve">Sem SPDA, o risco R1 atende ao tolerável com dPS compatíveis com NP III–IV na entrada das linhas. O SPDA NP III é adotado por opção do projeto (proteção do patrimônio ou exigência de outra regulamentação).</w:t>
       </w:r>
     </w:p>
     <w:p>
@@ -6322,6 +6322,4202 @@
         <w:t xml:space="preserve">CREA/CFT nº 000000 — ART a emitir</w:t>
       </w:r>
     </w:p>
+    <w:p>
+      <w:pPr>
+        <w:pStyle w:val="Heading1"/>
+        <w:keepNext/>
+        <w:pBdr>
+          <w:bottom w:val="single" w:color="B9C3CB" w:sz="4"/>
+        </w:pBdr>
+        <w:spacing w:before="320" w:after="140"/>
+      </w:pPr>
+      <w:r>
+        <w:rPr>
+          <w:b/>
+          <w:bCs/>
+          <w:color w:val="0B5A70"/>
+          <w:sz w:val="26"/>
+          <w:szCs w:val="26"/>
+          <w:rFonts w:ascii="Calibri" w:cs="Calibri" w:eastAsia="Calibri" w:hAnsi="Calibri"/>
+        </w:rPr>
+        <w:t xml:space="preserve">ANEXO — DENSIDADE DE DESCARGAS ATMOSFÉRICAS NG EM MATO GROSSO DO SUL</w:t>
+      </w:r>
+    </w:p>
+    <w:p>
+      <w:pPr>
+        <w:spacing w:after="100" w:before="0"/>
+      </w:pPr>
+      <w:r>
+        <w:rPr>
+          <w:sz w:val="20"/>
+          <w:szCs w:val="20"/>
+          <w:rFonts w:ascii="Calibri" w:cs="Calibri" w:eastAsia="Calibri" w:hAnsi="Calibri"/>
+        </w:rPr>
+        <w:t xml:space="preserve">Valores de NG (descargas atmosféricas por km² por ano) dos 79 municípios de Mato Grosso do Sul, conforme a tabela municipal do Anexo F da ABNT NBR 5419-2:2026. Valor adotado neste memorial: Campo Grande, NG = 30.</w:t>
+      </w:r>
+    </w:p>
+    <w:tbl>
+      <w:tblPr>
+        <w:tblW w:type="pct" w:w="100%"/>
+        <w:tblBorders>
+          <w:top w:val="single" w:color="auto" w:sz="4"/>
+          <w:left w:val="single" w:color="auto" w:sz="4"/>
+          <w:bottom w:val="single" w:color="auto" w:sz="4"/>
+          <w:right w:val="single" w:color="auto" w:sz="4"/>
+          <w:insideH w:val="single" w:color="auto" w:sz="4"/>
+          <w:insideV w:val="single" w:color="auto" w:sz="4"/>
+        </w:tblBorders>
+        <w:tblLayout w:type="fixed"/>
+      </w:tblPr>
+      <w:tblGrid>
+        <w:gridCol w:w="3707"/>
+        <w:gridCol w:w="1171"/>
+        <w:gridCol w:w="3707"/>
+        <w:gridCol w:w="1171"/>
+      </w:tblGrid>
+      <w:tr>
+        <w:trPr>
+          <w:tblHeader/>
+        </w:trPr>
+        <w:tc>
+          <w:tcPr>
+            <w:tcW w:type="dxa" w:w="3707"/>
+            <w:shd w:fill="E7EDF1" w:color="auto" w:val="clear"/>
+            <w:tcMar>
+              <w:top w:type="dxa" w:w="30"/>
+              <w:left w:type="dxa" w:w="70"/>
+              <w:bottom w:type="dxa" w:w="30"/>
+              <w:right w:type="dxa" w:w="70"/>
+            </w:tcMar>
+          </w:tcPr>
+          <w:p>
+            <w:pPr>
+              <w:jc w:val="left"/>
+            </w:pPr>
+            <w:r>
+              <w:rPr>
+                <w:b/>
+                <w:bCs/>
+                <w:sz w:val="15"/>
+                <w:szCs w:val="15"/>
+                <w:rFonts w:ascii="Calibri" w:cs="Calibri" w:eastAsia="Calibri" w:hAnsi="Calibri"/>
+              </w:rPr>
+              <w:t xml:space="preserve">Município</w:t>
+            </w:r>
+          </w:p>
+        </w:tc>
+        <w:tc>
+          <w:tcPr>
+            <w:tcW w:type="dxa" w:w="1171"/>
+            <w:shd w:fill="E7EDF1" w:color="auto" w:val="clear"/>
+            <w:tcMar>
+              <w:top w:type="dxa" w:w="30"/>
+              <w:left w:type="dxa" w:w="70"/>
+              <w:bottom w:type="dxa" w:w="30"/>
+              <w:right w:type="dxa" w:w="70"/>
+            </w:tcMar>
+          </w:tcPr>
+          <w:p>
+            <w:pPr>
+              <w:jc w:val="right"/>
+            </w:pPr>
+            <w:r>
+              <w:rPr>
+                <w:b/>
+                <w:bCs/>
+                <w:sz w:val="15"/>
+                <w:szCs w:val="15"/>
+                <w:rFonts w:ascii="Calibri" w:cs="Calibri" w:eastAsia="Calibri" w:hAnsi="Calibri"/>
+              </w:rPr>
+              <w:t xml:space="preserve">NG</w:t>
+            </w:r>
+          </w:p>
+        </w:tc>
+        <w:tc>
+          <w:tcPr>
+            <w:tcW w:type="dxa" w:w="3707"/>
+            <w:shd w:fill="E7EDF1" w:color="auto" w:val="clear"/>
+            <w:tcMar>
+              <w:top w:type="dxa" w:w="30"/>
+              <w:left w:type="dxa" w:w="70"/>
+              <w:bottom w:type="dxa" w:w="30"/>
+              <w:right w:type="dxa" w:w="70"/>
+            </w:tcMar>
+          </w:tcPr>
+          <w:p>
+            <w:pPr>
+              <w:jc w:val="left"/>
+            </w:pPr>
+            <w:r>
+              <w:rPr>
+                <w:b/>
+                <w:bCs/>
+                <w:sz w:val="15"/>
+                <w:szCs w:val="15"/>
+                <w:rFonts w:ascii="Calibri" w:cs="Calibri" w:eastAsia="Calibri" w:hAnsi="Calibri"/>
+              </w:rPr>
+              <w:t xml:space="preserve">Município</w:t>
+            </w:r>
+          </w:p>
+        </w:tc>
+        <w:tc>
+          <w:tcPr>
+            <w:tcW w:type="dxa" w:w="1171"/>
+            <w:shd w:fill="E7EDF1" w:color="auto" w:val="clear"/>
+            <w:tcMar>
+              <w:top w:type="dxa" w:w="30"/>
+              <w:left w:type="dxa" w:w="70"/>
+              <w:bottom w:type="dxa" w:w="30"/>
+              <w:right w:type="dxa" w:w="70"/>
+            </w:tcMar>
+          </w:tcPr>
+          <w:p>
+            <w:pPr>
+              <w:jc w:val="right"/>
+            </w:pPr>
+            <w:r>
+              <w:rPr>
+                <w:b/>
+                <w:bCs/>
+                <w:sz w:val="15"/>
+                <w:szCs w:val="15"/>
+                <w:rFonts w:ascii="Calibri" w:cs="Calibri" w:eastAsia="Calibri" w:hAnsi="Calibri"/>
+              </w:rPr>
+              <w:t xml:space="preserve">NG</w:t>
+            </w:r>
+          </w:p>
+        </w:tc>
+      </w:tr>
+      <w:tr>
+        <w:trPr>
+          <w:cantSplit/>
+        </w:trPr>
+        <w:tc>
+          <w:tcPr>
+            <w:tcW w:type="dxa" w:w="3707"/>
+            <w:tcMar>
+              <w:top w:type="dxa" w:w="30"/>
+              <w:left w:type="dxa" w:w="70"/>
+              <w:bottom w:type="dxa" w:w="30"/>
+              <w:right w:type="dxa" w:w="70"/>
+            </w:tcMar>
+          </w:tcPr>
+          <w:p>
+            <w:pPr>
+              <w:jc w:val="left"/>
+            </w:pPr>
+            <w:r>
+              <w:rPr>
+                <w:sz w:val="15"/>
+                <w:szCs w:val="15"/>
+                <w:rFonts w:ascii="Calibri" w:cs="Calibri" w:eastAsia="Calibri" w:hAnsi="Calibri"/>
+              </w:rPr>
+              <w:t xml:space="preserve">Água Clara</w:t>
+            </w:r>
+          </w:p>
+        </w:tc>
+        <w:tc>
+          <w:tcPr>
+            <w:tcW w:type="dxa" w:w="1171"/>
+            <w:tcMar>
+              <w:top w:type="dxa" w:w="30"/>
+              <w:left w:type="dxa" w:w="70"/>
+              <w:bottom w:type="dxa" w:w="30"/>
+              <w:right w:type="dxa" w:w="70"/>
+            </w:tcMar>
+          </w:tcPr>
+          <w:p>
+            <w:pPr>
+              <w:jc w:val="right"/>
+            </w:pPr>
+            <w:r>
+              <w:rPr>
+                <w:sz w:val="15"/>
+                <w:szCs w:val="15"/>
+                <w:rFonts w:ascii="Calibri" w:cs="Calibri" w:eastAsia="Calibri" w:hAnsi="Calibri"/>
+              </w:rPr>
+              <w:t xml:space="preserve">26</w:t>
+            </w:r>
+          </w:p>
+        </w:tc>
+        <w:tc>
+          <w:tcPr>
+            <w:tcW w:type="dxa" w:w="3707"/>
+            <w:tcMar>
+              <w:top w:type="dxa" w:w="30"/>
+              <w:left w:type="dxa" w:w="70"/>
+              <w:bottom w:type="dxa" w:w="30"/>
+              <w:right w:type="dxa" w:w="70"/>
+            </w:tcMar>
+          </w:tcPr>
+          <w:p>
+            <w:pPr>
+              <w:jc w:val="left"/>
+            </w:pPr>
+            <w:r>
+              <w:rPr>
+                <w:sz w:val="15"/>
+                <w:szCs w:val="15"/>
+                <w:rFonts w:ascii="Calibri" w:cs="Calibri" w:eastAsia="Calibri" w:hAnsi="Calibri"/>
+              </w:rPr>
+              <w:t xml:space="preserve">Itaquiraí</w:t>
+            </w:r>
+          </w:p>
+        </w:tc>
+        <w:tc>
+          <w:tcPr>
+            <w:tcW w:type="dxa" w:w="1171"/>
+            <w:tcMar>
+              <w:top w:type="dxa" w:w="30"/>
+              <w:left w:type="dxa" w:w="70"/>
+              <w:bottom w:type="dxa" w:w="30"/>
+              <w:right w:type="dxa" w:w="70"/>
+            </w:tcMar>
+          </w:tcPr>
+          <w:p>
+            <w:pPr>
+              <w:jc w:val="right"/>
+            </w:pPr>
+            <w:r>
+              <w:rPr>
+                <w:sz w:val="15"/>
+                <w:szCs w:val="15"/>
+                <w:rFonts w:ascii="Calibri" w:cs="Calibri" w:eastAsia="Calibri" w:hAnsi="Calibri"/>
+              </w:rPr>
+              <w:t xml:space="preserve">24</w:t>
+            </w:r>
+          </w:p>
+        </w:tc>
+      </w:tr>
+      <w:tr>
+        <w:trPr>
+          <w:cantSplit/>
+        </w:trPr>
+        <w:tc>
+          <w:tcPr>
+            <w:tcW w:type="dxa" w:w="3707"/>
+            <w:tcMar>
+              <w:top w:type="dxa" w:w="30"/>
+              <w:left w:type="dxa" w:w="70"/>
+              <w:bottom w:type="dxa" w:w="30"/>
+              <w:right w:type="dxa" w:w="70"/>
+            </w:tcMar>
+          </w:tcPr>
+          <w:p>
+            <w:pPr>
+              <w:jc w:val="left"/>
+            </w:pPr>
+            <w:r>
+              <w:rPr>
+                <w:sz w:val="15"/>
+                <w:szCs w:val="15"/>
+                <w:rFonts w:ascii="Calibri" w:cs="Calibri" w:eastAsia="Calibri" w:hAnsi="Calibri"/>
+              </w:rPr>
+              <w:t xml:space="preserve">Alcinópolis</w:t>
+            </w:r>
+          </w:p>
+        </w:tc>
+        <w:tc>
+          <w:tcPr>
+            <w:tcW w:type="dxa" w:w="1171"/>
+            <w:tcMar>
+              <w:top w:type="dxa" w:w="30"/>
+              <w:left w:type="dxa" w:w="70"/>
+              <w:bottom w:type="dxa" w:w="30"/>
+              <w:right w:type="dxa" w:w="70"/>
+            </w:tcMar>
+          </w:tcPr>
+          <w:p>
+            <w:pPr>
+              <w:jc w:val="right"/>
+            </w:pPr>
+            <w:r>
+              <w:rPr>
+                <w:sz w:val="15"/>
+                <w:szCs w:val="15"/>
+                <w:rFonts w:ascii="Calibri" w:cs="Calibri" w:eastAsia="Calibri" w:hAnsi="Calibri"/>
+              </w:rPr>
+              <w:t xml:space="preserve">24</w:t>
+            </w:r>
+          </w:p>
+        </w:tc>
+        <w:tc>
+          <w:tcPr>
+            <w:tcW w:type="dxa" w:w="3707"/>
+            <w:tcMar>
+              <w:top w:type="dxa" w:w="30"/>
+              <w:left w:type="dxa" w:w="70"/>
+              <w:bottom w:type="dxa" w:w="30"/>
+              <w:right w:type="dxa" w:w="70"/>
+            </w:tcMar>
+          </w:tcPr>
+          <w:p>
+            <w:pPr>
+              <w:jc w:val="left"/>
+            </w:pPr>
+            <w:r>
+              <w:rPr>
+                <w:sz w:val="15"/>
+                <w:szCs w:val="15"/>
+                <w:rFonts w:ascii="Calibri" w:cs="Calibri" w:eastAsia="Calibri" w:hAnsi="Calibri"/>
+              </w:rPr>
+              <w:t xml:space="preserve">Ivinhema</w:t>
+            </w:r>
+          </w:p>
+        </w:tc>
+        <w:tc>
+          <w:tcPr>
+            <w:tcW w:type="dxa" w:w="1171"/>
+            <w:tcMar>
+              <w:top w:type="dxa" w:w="30"/>
+              <w:left w:type="dxa" w:w="70"/>
+              <w:bottom w:type="dxa" w:w="30"/>
+              <w:right w:type="dxa" w:w="70"/>
+            </w:tcMar>
+          </w:tcPr>
+          <w:p>
+            <w:pPr>
+              <w:jc w:val="right"/>
+            </w:pPr>
+            <w:r>
+              <w:rPr>
+                <w:sz w:val="15"/>
+                <w:szCs w:val="15"/>
+                <w:rFonts w:ascii="Calibri" w:cs="Calibri" w:eastAsia="Calibri" w:hAnsi="Calibri"/>
+              </w:rPr>
+              <w:t xml:space="preserve">24</w:t>
+            </w:r>
+          </w:p>
+        </w:tc>
+      </w:tr>
+      <w:tr>
+        <w:trPr>
+          <w:cantSplit/>
+        </w:trPr>
+        <w:tc>
+          <w:tcPr>
+            <w:tcW w:type="dxa" w:w="3707"/>
+            <w:tcMar>
+              <w:top w:type="dxa" w:w="30"/>
+              <w:left w:type="dxa" w:w="70"/>
+              <w:bottom w:type="dxa" w:w="30"/>
+              <w:right w:type="dxa" w:w="70"/>
+            </w:tcMar>
+          </w:tcPr>
+          <w:p>
+            <w:pPr>
+              <w:jc w:val="left"/>
+            </w:pPr>
+            <w:r>
+              <w:rPr>
+                <w:sz w:val="15"/>
+                <w:szCs w:val="15"/>
+                <w:rFonts w:ascii="Calibri" w:cs="Calibri" w:eastAsia="Calibri" w:hAnsi="Calibri"/>
+              </w:rPr>
+              <w:t xml:space="preserve">Amambai</w:t>
+            </w:r>
+          </w:p>
+        </w:tc>
+        <w:tc>
+          <w:tcPr>
+            <w:tcW w:type="dxa" w:w="1171"/>
+            <w:tcMar>
+              <w:top w:type="dxa" w:w="30"/>
+              <w:left w:type="dxa" w:w="70"/>
+              <w:bottom w:type="dxa" w:w="30"/>
+              <w:right w:type="dxa" w:w="70"/>
+            </w:tcMar>
+          </w:tcPr>
+          <w:p>
+            <w:pPr>
+              <w:jc w:val="right"/>
+            </w:pPr>
+            <w:r>
+              <w:rPr>
+                <w:sz w:val="15"/>
+                <w:szCs w:val="15"/>
+                <w:rFonts w:ascii="Calibri" w:cs="Calibri" w:eastAsia="Calibri" w:hAnsi="Calibri"/>
+              </w:rPr>
+              <w:t xml:space="preserve">24</w:t>
+            </w:r>
+          </w:p>
+        </w:tc>
+        <w:tc>
+          <w:tcPr>
+            <w:tcW w:type="dxa" w:w="3707"/>
+            <w:tcMar>
+              <w:top w:type="dxa" w:w="30"/>
+              <w:left w:type="dxa" w:w="70"/>
+              <w:bottom w:type="dxa" w:w="30"/>
+              <w:right w:type="dxa" w:w="70"/>
+            </w:tcMar>
+          </w:tcPr>
+          <w:p>
+            <w:pPr>
+              <w:jc w:val="left"/>
+            </w:pPr>
+            <w:r>
+              <w:rPr>
+                <w:sz w:val="15"/>
+                <w:szCs w:val="15"/>
+                <w:rFonts w:ascii="Calibri" w:cs="Calibri" w:eastAsia="Calibri" w:hAnsi="Calibri"/>
+              </w:rPr>
+              <w:t xml:space="preserve">Japorã</w:t>
+            </w:r>
+          </w:p>
+        </w:tc>
+        <w:tc>
+          <w:tcPr>
+            <w:tcW w:type="dxa" w:w="1171"/>
+            <w:tcMar>
+              <w:top w:type="dxa" w:w="30"/>
+              <w:left w:type="dxa" w:w="70"/>
+              <w:bottom w:type="dxa" w:w="30"/>
+              <w:right w:type="dxa" w:w="70"/>
+            </w:tcMar>
+          </w:tcPr>
+          <w:p>
+            <w:pPr>
+              <w:jc w:val="right"/>
+            </w:pPr>
+            <w:r>
+              <w:rPr>
+                <w:sz w:val="15"/>
+                <w:szCs w:val="15"/>
+                <w:rFonts w:ascii="Calibri" w:cs="Calibri" w:eastAsia="Calibri" w:hAnsi="Calibri"/>
+              </w:rPr>
+              <w:t xml:space="preserve">24</w:t>
+            </w:r>
+          </w:p>
+        </w:tc>
+      </w:tr>
+      <w:tr>
+        <w:trPr>
+          <w:cantSplit/>
+        </w:trPr>
+        <w:tc>
+          <w:tcPr>
+            <w:tcW w:type="dxa" w:w="3707"/>
+            <w:tcMar>
+              <w:top w:type="dxa" w:w="30"/>
+              <w:left w:type="dxa" w:w="70"/>
+              <w:bottom w:type="dxa" w:w="30"/>
+              <w:right w:type="dxa" w:w="70"/>
+            </w:tcMar>
+          </w:tcPr>
+          <w:p>
+            <w:pPr>
+              <w:jc w:val="left"/>
+            </w:pPr>
+            <w:r>
+              <w:rPr>
+                <w:sz w:val="15"/>
+                <w:szCs w:val="15"/>
+                <w:rFonts w:ascii="Calibri" w:cs="Calibri" w:eastAsia="Calibri" w:hAnsi="Calibri"/>
+              </w:rPr>
+              <w:t xml:space="preserve">Anastácio</w:t>
+            </w:r>
+          </w:p>
+        </w:tc>
+        <w:tc>
+          <w:tcPr>
+            <w:tcW w:type="dxa" w:w="1171"/>
+            <w:tcMar>
+              <w:top w:type="dxa" w:w="30"/>
+              <w:left w:type="dxa" w:w="70"/>
+              <w:bottom w:type="dxa" w:w="30"/>
+              <w:right w:type="dxa" w:w="70"/>
+            </w:tcMar>
+          </w:tcPr>
+          <w:p>
+            <w:pPr>
+              <w:jc w:val="right"/>
+            </w:pPr>
+            <w:r>
+              <w:rPr>
+                <w:sz w:val="15"/>
+                <w:szCs w:val="15"/>
+                <w:rFonts w:ascii="Calibri" w:cs="Calibri" w:eastAsia="Calibri" w:hAnsi="Calibri"/>
+              </w:rPr>
+              <w:t xml:space="preserve">22</w:t>
+            </w:r>
+          </w:p>
+        </w:tc>
+        <w:tc>
+          <w:tcPr>
+            <w:tcW w:type="dxa" w:w="3707"/>
+            <w:tcMar>
+              <w:top w:type="dxa" w:w="30"/>
+              <w:left w:type="dxa" w:w="70"/>
+              <w:bottom w:type="dxa" w:w="30"/>
+              <w:right w:type="dxa" w:w="70"/>
+            </w:tcMar>
+          </w:tcPr>
+          <w:p>
+            <w:pPr>
+              <w:jc w:val="left"/>
+            </w:pPr>
+            <w:r>
+              <w:rPr>
+                <w:sz w:val="15"/>
+                <w:szCs w:val="15"/>
+                <w:rFonts w:ascii="Calibri" w:cs="Calibri" w:eastAsia="Calibri" w:hAnsi="Calibri"/>
+              </w:rPr>
+              <w:t xml:space="preserve">Jaraguari</w:t>
+            </w:r>
+          </w:p>
+        </w:tc>
+        <w:tc>
+          <w:tcPr>
+            <w:tcW w:type="dxa" w:w="1171"/>
+            <w:tcMar>
+              <w:top w:type="dxa" w:w="30"/>
+              <w:left w:type="dxa" w:w="70"/>
+              <w:bottom w:type="dxa" w:w="30"/>
+              <w:right w:type="dxa" w:w="70"/>
+            </w:tcMar>
+          </w:tcPr>
+          <w:p>
+            <w:pPr>
+              <w:jc w:val="right"/>
+            </w:pPr>
+            <w:r>
+              <w:rPr>
+                <w:sz w:val="15"/>
+                <w:szCs w:val="15"/>
+                <w:rFonts w:ascii="Calibri" w:cs="Calibri" w:eastAsia="Calibri" w:hAnsi="Calibri"/>
+              </w:rPr>
+              <w:t xml:space="preserve">24</w:t>
+            </w:r>
+          </w:p>
+        </w:tc>
+      </w:tr>
+      <w:tr>
+        <w:trPr>
+          <w:cantSplit/>
+        </w:trPr>
+        <w:tc>
+          <w:tcPr>
+            <w:tcW w:type="dxa" w:w="3707"/>
+            <w:tcMar>
+              <w:top w:type="dxa" w:w="30"/>
+              <w:left w:type="dxa" w:w="70"/>
+              <w:bottom w:type="dxa" w:w="30"/>
+              <w:right w:type="dxa" w:w="70"/>
+            </w:tcMar>
+          </w:tcPr>
+          <w:p>
+            <w:pPr>
+              <w:jc w:val="left"/>
+            </w:pPr>
+            <w:r>
+              <w:rPr>
+                <w:sz w:val="15"/>
+                <w:szCs w:val="15"/>
+                <w:rFonts w:ascii="Calibri" w:cs="Calibri" w:eastAsia="Calibri" w:hAnsi="Calibri"/>
+              </w:rPr>
+              <w:t xml:space="preserve">Anaurilândia</w:t>
+            </w:r>
+          </w:p>
+        </w:tc>
+        <w:tc>
+          <w:tcPr>
+            <w:tcW w:type="dxa" w:w="1171"/>
+            <w:tcMar>
+              <w:top w:type="dxa" w:w="30"/>
+              <w:left w:type="dxa" w:w="70"/>
+              <w:bottom w:type="dxa" w:w="30"/>
+              <w:right w:type="dxa" w:w="70"/>
+            </w:tcMar>
+          </w:tcPr>
+          <w:p>
+            <w:pPr>
+              <w:jc w:val="right"/>
+            </w:pPr>
+            <w:r>
+              <w:rPr>
+                <w:sz w:val="15"/>
+                <w:szCs w:val="15"/>
+                <w:rFonts w:ascii="Calibri" w:cs="Calibri" w:eastAsia="Calibri" w:hAnsi="Calibri"/>
+              </w:rPr>
+              <w:t xml:space="preserve">24</w:t>
+            </w:r>
+          </w:p>
+        </w:tc>
+        <w:tc>
+          <w:tcPr>
+            <w:tcW w:type="dxa" w:w="3707"/>
+            <w:tcMar>
+              <w:top w:type="dxa" w:w="30"/>
+              <w:left w:type="dxa" w:w="70"/>
+              <w:bottom w:type="dxa" w:w="30"/>
+              <w:right w:type="dxa" w:w="70"/>
+            </w:tcMar>
+          </w:tcPr>
+          <w:p>
+            <w:pPr>
+              <w:jc w:val="left"/>
+            </w:pPr>
+            <w:r>
+              <w:rPr>
+                <w:sz w:val="15"/>
+                <w:szCs w:val="15"/>
+                <w:rFonts w:ascii="Calibri" w:cs="Calibri" w:eastAsia="Calibri" w:hAnsi="Calibri"/>
+              </w:rPr>
+              <w:t xml:space="preserve">Jardim</w:t>
+            </w:r>
+          </w:p>
+        </w:tc>
+        <w:tc>
+          <w:tcPr>
+            <w:tcW w:type="dxa" w:w="1171"/>
+            <w:tcMar>
+              <w:top w:type="dxa" w:w="30"/>
+              <w:left w:type="dxa" w:w="70"/>
+              <w:bottom w:type="dxa" w:w="30"/>
+              <w:right w:type="dxa" w:w="70"/>
+            </w:tcMar>
+          </w:tcPr>
+          <w:p>
+            <w:pPr>
+              <w:jc w:val="right"/>
+            </w:pPr>
+            <w:r>
+              <w:rPr>
+                <w:sz w:val="15"/>
+                <w:szCs w:val="15"/>
+                <w:rFonts w:ascii="Calibri" w:cs="Calibri" w:eastAsia="Calibri" w:hAnsi="Calibri"/>
+              </w:rPr>
+              <w:t xml:space="preserve">22</w:t>
+            </w:r>
+          </w:p>
+        </w:tc>
+      </w:tr>
+      <w:tr>
+        <w:trPr>
+          <w:cantSplit/>
+        </w:trPr>
+        <w:tc>
+          <w:tcPr>
+            <w:tcW w:type="dxa" w:w="3707"/>
+            <w:tcMar>
+              <w:top w:type="dxa" w:w="30"/>
+              <w:left w:type="dxa" w:w="70"/>
+              <w:bottom w:type="dxa" w:w="30"/>
+              <w:right w:type="dxa" w:w="70"/>
+            </w:tcMar>
+          </w:tcPr>
+          <w:p>
+            <w:pPr>
+              <w:jc w:val="left"/>
+            </w:pPr>
+            <w:r>
+              <w:rPr>
+                <w:sz w:val="15"/>
+                <w:szCs w:val="15"/>
+                <w:rFonts w:ascii="Calibri" w:cs="Calibri" w:eastAsia="Calibri" w:hAnsi="Calibri"/>
+              </w:rPr>
+              <w:t xml:space="preserve">Angélica</w:t>
+            </w:r>
+          </w:p>
+        </w:tc>
+        <w:tc>
+          <w:tcPr>
+            <w:tcW w:type="dxa" w:w="1171"/>
+            <w:tcMar>
+              <w:top w:type="dxa" w:w="30"/>
+              <w:left w:type="dxa" w:w="70"/>
+              <w:bottom w:type="dxa" w:w="30"/>
+              <w:right w:type="dxa" w:w="70"/>
+            </w:tcMar>
+          </w:tcPr>
+          <w:p>
+            <w:pPr>
+              <w:jc w:val="right"/>
+            </w:pPr>
+            <w:r>
+              <w:rPr>
+                <w:sz w:val="15"/>
+                <w:szCs w:val="15"/>
+                <w:rFonts w:ascii="Calibri" w:cs="Calibri" w:eastAsia="Calibri" w:hAnsi="Calibri"/>
+              </w:rPr>
+              <w:t xml:space="preserve">22</w:t>
+            </w:r>
+          </w:p>
+        </w:tc>
+        <w:tc>
+          <w:tcPr>
+            <w:tcW w:type="dxa" w:w="3707"/>
+            <w:tcMar>
+              <w:top w:type="dxa" w:w="30"/>
+              <w:left w:type="dxa" w:w="70"/>
+              <w:bottom w:type="dxa" w:w="30"/>
+              <w:right w:type="dxa" w:w="70"/>
+            </w:tcMar>
+          </w:tcPr>
+          <w:p>
+            <w:pPr>
+              <w:jc w:val="left"/>
+            </w:pPr>
+            <w:r>
+              <w:rPr>
+                <w:sz w:val="15"/>
+                <w:szCs w:val="15"/>
+                <w:rFonts w:ascii="Calibri" w:cs="Calibri" w:eastAsia="Calibri" w:hAnsi="Calibri"/>
+              </w:rPr>
+              <w:t xml:space="preserve">Jateí</w:t>
+            </w:r>
+          </w:p>
+        </w:tc>
+        <w:tc>
+          <w:tcPr>
+            <w:tcW w:type="dxa" w:w="1171"/>
+            <w:tcMar>
+              <w:top w:type="dxa" w:w="30"/>
+              <w:left w:type="dxa" w:w="70"/>
+              <w:bottom w:type="dxa" w:w="30"/>
+              <w:right w:type="dxa" w:w="70"/>
+            </w:tcMar>
+          </w:tcPr>
+          <w:p>
+            <w:pPr>
+              <w:jc w:val="right"/>
+            </w:pPr>
+            <w:r>
+              <w:rPr>
+                <w:sz w:val="15"/>
+                <w:szCs w:val="15"/>
+                <w:rFonts w:ascii="Calibri" w:cs="Calibri" w:eastAsia="Calibri" w:hAnsi="Calibri"/>
+              </w:rPr>
+              <w:t xml:space="preserve">22</w:t>
+            </w:r>
+          </w:p>
+        </w:tc>
+      </w:tr>
+      <w:tr>
+        <w:trPr>
+          <w:cantSplit/>
+        </w:trPr>
+        <w:tc>
+          <w:tcPr>
+            <w:tcW w:type="dxa" w:w="3707"/>
+            <w:tcMar>
+              <w:top w:type="dxa" w:w="30"/>
+              <w:left w:type="dxa" w:w="70"/>
+              <w:bottom w:type="dxa" w:w="30"/>
+              <w:right w:type="dxa" w:w="70"/>
+            </w:tcMar>
+          </w:tcPr>
+          <w:p>
+            <w:pPr>
+              <w:jc w:val="left"/>
+            </w:pPr>
+            <w:r>
+              <w:rPr>
+                <w:sz w:val="15"/>
+                <w:szCs w:val="15"/>
+                <w:rFonts w:ascii="Calibri" w:cs="Calibri" w:eastAsia="Calibri" w:hAnsi="Calibri"/>
+              </w:rPr>
+              <w:t xml:space="preserve">Antônio João</w:t>
+            </w:r>
+          </w:p>
+        </w:tc>
+        <w:tc>
+          <w:tcPr>
+            <w:tcW w:type="dxa" w:w="1171"/>
+            <w:tcMar>
+              <w:top w:type="dxa" w:w="30"/>
+              <w:left w:type="dxa" w:w="70"/>
+              <w:bottom w:type="dxa" w:w="30"/>
+              <w:right w:type="dxa" w:w="70"/>
+            </w:tcMar>
+          </w:tcPr>
+          <w:p>
+            <w:pPr>
+              <w:jc w:val="right"/>
+            </w:pPr>
+            <w:r>
+              <w:rPr>
+                <w:sz w:val="15"/>
+                <w:szCs w:val="15"/>
+                <w:rFonts w:ascii="Calibri" w:cs="Calibri" w:eastAsia="Calibri" w:hAnsi="Calibri"/>
+              </w:rPr>
+              <w:t xml:space="preserve">24</w:t>
+            </w:r>
+          </w:p>
+        </w:tc>
+        <w:tc>
+          <w:tcPr>
+            <w:tcW w:type="dxa" w:w="3707"/>
+            <w:tcMar>
+              <w:top w:type="dxa" w:w="30"/>
+              <w:left w:type="dxa" w:w="70"/>
+              <w:bottom w:type="dxa" w:w="30"/>
+              <w:right w:type="dxa" w:w="70"/>
+            </w:tcMar>
+          </w:tcPr>
+          <w:p>
+            <w:pPr>
+              <w:jc w:val="left"/>
+            </w:pPr>
+            <w:r>
+              <w:rPr>
+                <w:sz w:val="15"/>
+                <w:szCs w:val="15"/>
+                <w:rFonts w:ascii="Calibri" w:cs="Calibri" w:eastAsia="Calibri" w:hAnsi="Calibri"/>
+              </w:rPr>
+              <w:t xml:space="preserve">Juti</w:t>
+            </w:r>
+          </w:p>
+        </w:tc>
+        <w:tc>
+          <w:tcPr>
+            <w:tcW w:type="dxa" w:w="1171"/>
+            <w:tcMar>
+              <w:top w:type="dxa" w:w="30"/>
+              <w:left w:type="dxa" w:w="70"/>
+              <w:bottom w:type="dxa" w:w="30"/>
+              <w:right w:type="dxa" w:w="70"/>
+            </w:tcMar>
+          </w:tcPr>
+          <w:p>
+            <w:pPr>
+              <w:jc w:val="right"/>
+            </w:pPr>
+            <w:r>
+              <w:rPr>
+                <w:sz w:val="15"/>
+                <w:szCs w:val="15"/>
+                <w:rFonts w:ascii="Calibri" w:cs="Calibri" w:eastAsia="Calibri" w:hAnsi="Calibri"/>
+              </w:rPr>
+              <w:t xml:space="preserve">22</w:t>
+            </w:r>
+          </w:p>
+        </w:tc>
+      </w:tr>
+      <w:tr>
+        <w:trPr>
+          <w:cantSplit/>
+        </w:trPr>
+        <w:tc>
+          <w:tcPr>
+            <w:tcW w:type="dxa" w:w="3707"/>
+            <w:tcMar>
+              <w:top w:type="dxa" w:w="30"/>
+              <w:left w:type="dxa" w:w="70"/>
+              <w:bottom w:type="dxa" w:w="30"/>
+              <w:right w:type="dxa" w:w="70"/>
+            </w:tcMar>
+          </w:tcPr>
+          <w:p>
+            <w:pPr>
+              <w:jc w:val="left"/>
+            </w:pPr>
+            <w:r>
+              <w:rPr>
+                <w:sz w:val="15"/>
+                <w:szCs w:val="15"/>
+                <w:rFonts w:ascii="Calibri" w:cs="Calibri" w:eastAsia="Calibri" w:hAnsi="Calibri"/>
+              </w:rPr>
+              <w:t xml:space="preserve">Aparecida do Taboado</w:t>
+            </w:r>
+          </w:p>
+        </w:tc>
+        <w:tc>
+          <w:tcPr>
+            <w:tcW w:type="dxa" w:w="1171"/>
+            <w:tcMar>
+              <w:top w:type="dxa" w:w="30"/>
+              <w:left w:type="dxa" w:w="70"/>
+              <w:bottom w:type="dxa" w:w="30"/>
+              <w:right w:type="dxa" w:w="70"/>
+            </w:tcMar>
+          </w:tcPr>
+          <w:p>
+            <w:pPr>
+              <w:jc w:val="right"/>
+            </w:pPr>
+            <w:r>
+              <w:rPr>
+                <w:sz w:val="15"/>
+                <w:szCs w:val="15"/>
+                <w:rFonts w:ascii="Calibri" w:cs="Calibri" w:eastAsia="Calibri" w:hAnsi="Calibri"/>
+              </w:rPr>
+              <w:t xml:space="preserve">18</w:t>
+            </w:r>
+          </w:p>
+        </w:tc>
+        <w:tc>
+          <w:tcPr>
+            <w:tcW w:type="dxa" w:w="3707"/>
+            <w:tcMar>
+              <w:top w:type="dxa" w:w="30"/>
+              <w:left w:type="dxa" w:w="70"/>
+              <w:bottom w:type="dxa" w:w="30"/>
+              <w:right w:type="dxa" w:w="70"/>
+            </w:tcMar>
+          </w:tcPr>
+          <w:p>
+            <w:pPr>
+              <w:jc w:val="left"/>
+            </w:pPr>
+            <w:r>
+              <w:rPr>
+                <w:sz w:val="15"/>
+                <w:szCs w:val="15"/>
+                <w:rFonts w:ascii="Calibri" w:cs="Calibri" w:eastAsia="Calibri" w:hAnsi="Calibri"/>
+              </w:rPr>
+              <w:t xml:space="preserve">Ladário</w:t>
+            </w:r>
+          </w:p>
+        </w:tc>
+        <w:tc>
+          <w:tcPr>
+            <w:tcW w:type="dxa" w:w="1171"/>
+            <w:tcMar>
+              <w:top w:type="dxa" w:w="30"/>
+              <w:left w:type="dxa" w:w="70"/>
+              <w:bottom w:type="dxa" w:w="30"/>
+              <w:right w:type="dxa" w:w="70"/>
+            </w:tcMar>
+          </w:tcPr>
+          <w:p>
+            <w:pPr>
+              <w:jc w:val="right"/>
+            </w:pPr>
+            <w:r>
+              <w:rPr>
+                <w:sz w:val="15"/>
+                <w:szCs w:val="15"/>
+                <w:rFonts w:ascii="Calibri" w:cs="Calibri" w:eastAsia="Calibri" w:hAnsi="Calibri"/>
+              </w:rPr>
+              <w:t xml:space="preserve">16</w:t>
+            </w:r>
+          </w:p>
+        </w:tc>
+      </w:tr>
+      <w:tr>
+        <w:trPr>
+          <w:cantSplit/>
+        </w:trPr>
+        <w:tc>
+          <w:tcPr>
+            <w:tcW w:type="dxa" w:w="3707"/>
+            <w:tcMar>
+              <w:top w:type="dxa" w:w="30"/>
+              <w:left w:type="dxa" w:w="70"/>
+              <w:bottom w:type="dxa" w:w="30"/>
+              <w:right w:type="dxa" w:w="70"/>
+            </w:tcMar>
+          </w:tcPr>
+          <w:p>
+            <w:pPr>
+              <w:jc w:val="left"/>
+            </w:pPr>
+            <w:r>
+              <w:rPr>
+                <w:sz w:val="15"/>
+                <w:szCs w:val="15"/>
+                <w:rFonts w:ascii="Calibri" w:cs="Calibri" w:eastAsia="Calibri" w:hAnsi="Calibri"/>
+              </w:rPr>
+              <w:t xml:space="preserve">Aquidauana</w:t>
+            </w:r>
+          </w:p>
+        </w:tc>
+        <w:tc>
+          <w:tcPr>
+            <w:tcW w:type="dxa" w:w="1171"/>
+            <w:tcMar>
+              <w:top w:type="dxa" w:w="30"/>
+              <w:left w:type="dxa" w:w="70"/>
+              <w:bottom w:type="dxa" w:w="30"/>
+              <w:right w:type="dxa" w:w="70"/>
+            </w:tcMar>
+          </w:tcPr>
+          <w:p>
+            <w:pPr>
+              <w:jc w:val="right"/>
+            </w:pPr>
+            <w:r>
+              <w:rPr>
+                <w:sz w:val="15"/>
+                <w:szCs w:val="15"/>
+                <w:rFonts w:ascii="Calibri" w:cs="Calibri" w:eastAsia="Calibri" w:hAnsi="Calibri"/>
+              </w:rPr>
+              <w:t xml:space="preserve">24</w:t>
+            </w:r>
+          </w:p>
+        </w:tc>
+        <w:tc>
+          <w:tcPr>
+            <w:tcW w:type="dxa" w:w="3707"/>
+            <w:tcMar>
+              <w:top w:type="dxa" w:w="30"/>
+              <w:left w:type="dxa" w:w="70"/>
+              <w:bottom w:type="dxa" w:w="30"/>
+              <w:right w:type="dxa" w:w="70"/>
+            </w:tcMar>
+          </w:tcPr>
+          <w:p>
+            <w:pPr>
+              <w:jc w:val="left"/>
+            </w:pPr>
+            <w:r>
+              <w:rPr>
+                <w:sz w:val="15"/>
+                <w:szCs w:val="15"/>
+                <w:rFonts w:ascii="Calibri" w:cs="Calibri" w:eastAsia="Calibri" w:hAnsi="Calibri"/>
+              </w:rPr>
+              <w:t xml:space="preserve">Laguna Carapã</w:t>
+            </w:r>
+          </w:p>
+        </w:tc>
+        <w:tc>
+          <w:tcPr>
+            <w:tcW w:type="dxa" w:w="1171"/>
+            <w:tcMar>
+              <w:top w:type="dxa" w:w="30"/>
+              <w:left w:type="dxa" w:w="70"/>
+              <w:bottom w:type="dxa" w:w="30"/>
+              <w:right w:type="dxa" w:w="70"/>
+            </w:tcMar>
+          </w:tcPr>
+          <w:p>
+            <w:pPr>
+              <w:jc w:val="right"/>
+            </w:pPr>
+            <w:r>
+              <w:rPr>
+                <w:sz w:val="15"/>
+                <w:szCs w:val="15"/>
+                <w:rFonts w:ascii="Calibri" w:cs="Calibri" w:eastAsia="Calibri" w:hAnsi="Calibri"/>
+              </w:rPr>
+              <w:t xml:space="preserve">24</w:t>
+            </w:r>
+          </w:p>
+        </w:tc>
+      </w:tr>
+      <w:tr>
+        <w:trPr>
+          <w:cantSplit/>
+        </w:trPr>
+        <w:tc>
+          <w:tcPr>
+            <w:tcW w:type="dxa" w:w="3707"/>
+            <w:tcMar>
+              <w:top w:type="dxa" w:w="30"/>
+              <w:left w:type="dxa" w:w="70"/>
+              <w:bottom w:type="dxa" w:w="30"/>
+              <w:right w:type="dxa" w:w="70"/>
+            </w:tcMar>
+          </w:tcPr>
+          <w:p>
+            <w:pPr>
+              <w:jc w:val="left"/>
+            </w:pPr>
+            <w:r>
+              <w:rPr>
+                <w:sz w:val="15"/>
+                <w:szCs w:val="15"/>
+                <w:rFonts w:ascii="Calibri" w:cs="Calibri" w:eastAsia="Calibri" w:hAnsi="Calibri"/>
+              </w:rPr>
+              <w:t xml:space="preserve">Aral Moreira</w:t>
+            </w:r>
+          </w:p>
+        </w:tc>
+        <w:tc>
+          <w:tcPr>
+            <w:tcW w:type="dxa" w:w="1171"/>
+            <w:tcMar>
+              <w:top w:type="dxa" w:w="30"/>
+              <w:left w:type="dxa" w:w="70"/>
+              <w:bottom w:type="dxa" w:w="30"/>
+              <w:right w:type="dxa" w:w="70"/>
+            </w:tcMar>
+          </w:tcPr>
+          <w:p>
+            <w:pPr>
+              <w:jc w:val="right"/>
+            </w:pPr>
+            <w:r>
+              <w:rPr>
+                <w:sz w:val="15"/>
+                <w:szCs w:val="15"/>
+                <w:rFonts w:ascii="Calibri" w:cs="Calibri" w:eastAsia="Calibri" w:hAnsi="Calibri"/>
+              </w:rPr>
+              <w:t xml:space="preserve">26</w:t>
+            </w:r>
+          </w:p>
+        </w:tc>
+        <w:tc>
+          <w:tcPr>
+            <w:tcW w:type="dxa" w:w="3707"/>
+            <w:tcMar>
+              <w:top w:type="dxa" w:w="30"/>
+              <w:left w:type="dxa" w:w="70"/>
+              <w:bottom w:type="dxa" w:w="30"/>
+              <w:right w:type="dxa" w:w="70"/>
+            </w:tcMar>
+          </w:tcPr>
+          <w:p>
+            <w:pPr>
+              <w:jc w:val="left"/>
+            </w:pPr>
+            <w:r>
+              <w:rPr>
+                <w:sz w:val="15"/>
+                <w:szCs w:val="15"/>
+                <w:rFonts w:ascii="Calibri" w:cs="Calibri" w:eastAsia="Calibri" w:hAnsi="Calibri"/>
+              </w:rPr>
+              <w:t xml:space="preserve">Maracaju</w:t>
+            </w:r>
+          </w:p>
+        </w:tc>
+        <w:tc>
+          <w:tcPr>
+            <w:tcW w:type="dxa" w:w="1171"/>
+            <w:tcMar>
+              <w:top w:type="dxa" w:w="30"/>
+              <w:left w:type="dxa" w:w="70"/>
+              <w:bottom w:type="dxa" w:w="30"/>
+              <w:right w:type="dxa" w:w="70"/>
+            </w:tcMar>
+          </w:tcPr>
+          <w:p>
+            <w:pPr>
+              <w:jc w:val="right"/>
+            </w:pPr>
+            <w:r>
+              <w:rPr>
+                <w:sz w:val="15"/>
+                <w:szCs w:val="15"/>
+                <w:rFonts w:ascii="Calibri" w:cs="Calibri" w:eastAsia="Calibri" w:hAnsi="Calibri"/>
+              </w:rPr>
+              <w:t xml:space="preserve">24</w:t>
+            </w:r>
+          </w:p>
+        </w:tc>
+      </w:tr>
+      <w:tr>
+        <w:trPr>
+          <w:cantSplit/>
+        </w:trPr>
+        <w:tc>
+          <w:tcPr>
+            <w:tcW w:type="dxa" w:w="3707"/>
+            <w:tcMar>
+              <w:top w:type="dxa" w:w="30"/>
+              <w:left w:type="dxa" w:w="70"/>
+              <w:bottom w:type="dxa" w:w="30"/>
+              <w:right w:type="dxa" w:w="70"/>
+            </w:tcMar>
+          </w:tcPr>
+          <w:p>
+            <w:pPr>
+              <w:jc w:val="left"/>
+            </w:pPr>
+            <w:r>
+              <w:rPr>
+                <w:sz w:val="15"/>
+                <w:szCs w:val="15"/>
+                <w:rFonts w:ascii="Calibri" w:cs="Calibri" w:eastAsia="Calibri" w:hAnsi="Calibri"/>
+              </w:rPr>
+              <w:t xml:space="preserve">Bandeirantes</w:t>
+            </w:r>
+          </w:p>
+        </w:tc>
+        <w:tc>
+          <w:tcPr>
+            <w:tcW w:type="dxa" w:w="1171"/>
+            <w:tcMar>
+              <w:top w:type="dxa" w:w="30"/>
+              <w:left w:type="dxa" w:w="70"/>
+              <w:bottom w:type="dxa" w:w="30"/>
+              <w:right w:type="dxa" w:w="70"/>
+            </w:tcMar>
+          </w:tcPr>
+          <w:p>
+            <w:pPr>
+              <w:jc w:val="right"/>
+            </w:pPr>
+            <w:r>
+              <w:rPr>
+                <w:sz w:val="15"/>
+                <w:szCs w:val="15"/>
+                <w:rFonts w:ascii="Calibri" w:cs="Calibri" w:eastAsia="Calibri" w:hAnsi="Calibri"/>
+              </w:rPr>
+              <w:t xml:space="preserve">20</w:t>
+            </w:r>
+          </w:p>
+        </w:tc>
+        <w:tc>
+          <w:tcPr>
+            <w:tcW w:type="dxa" w:w="3707"/>
+            <w:tcMar>
+              <w:top w:type="dxa" w:w="30"/>
+              <w:left w:type="dxa" w:w="70"/>
+              <w:bottom w:type="dxa" w:w="30"/>
+              <w:right w:type="dxa" w:w="70"/>
+            </w:tcMar>
+          </w:tcPr>
+          <w:p>
+            <w:pPr>
+              <w:jc w:val="left"/>
+            </w:pPr>
+            <w:r>
+              <w:rPr>
+                <w:sz w:val="15"/>
+                <w:szCs w:val="15"/>
+                <w:rFonts w:ascii="Calibri" w:cs="Calibri" w:eastAsia="Calibri" w:hAnsi="Calibri"/>
+              </w:rPr>
+              <w:t xml:space="preserve">Miranda</w:t>
+            </w:r>
+          </w:p>
+        </w:tc>
+        <w:tc>
+          <w:tcPr>
+            <w:tcW w:type="dxa" w:w="1171"/>
+            <w:tcMar>
+              <w:top w:type="dxa" w:w="30"/>
+              <w:left w:type="dxa" w:w="70"/>
+              <w:bottom w:type="dxa" w:w="30"/>
+              <w:right w:type="dxa" w:w="70"/>
+            </w:tcMar>
+          </w:tcPr>
+          <w:p>
+            <w:pPr>
+              <w:jc w:val="right"/>
+            </w:pPr>
+            <w:r>
+              <w:rPr>
+                <w:sz w:val="15"/>
+                <w:szCs w:val="15"/>
+                <w:rFonts w:ascii="Calibri" w:cs="Calibri" w:eastAsia="Calibri" w:hAnsi="Calibri"/>
+              </w:rPr>
+              <w:t xml:space="preserve">20</w:t>
+            </w:r>
+          </w:p>
+        </w:tc>
+      </w:tr>
+      <w:tr>
+        <w:trPr>
+          <w:cantSplit/>
+        </w:trPr>
+        <w:tc>
+          <w:tcPr>
+            <w:tcW w:type="dxa" w:w="3707"/>
+            <w:tcMar>
+              <w:top w:type="dxa" w:w="30"/>
+              <w:left w:type="dxa" w:w="70"/>
+              <w:bottom w:type="dxa" w:w="30"/>
+              <w:right w:type="dxa" w:w="70"/>
+            </w:tcMar>
+          </w:tcPr>
+          <w:p>
+            <w:pPr>
+              <w:jc w:val="left"/>
+            </w:pPr>
+            <w:r>
+              <w:rPr>
+                <w:sz w:val="15"/>
+                <w:szCs w:val="15"/>
+                <w:rFonts w:ascii="Calibri" w:cs="Calibri" w:eastAsia="Calibri" w:hAnsi="Calibri"/>
+              </w:rPr>
+              <w:t xml:space="preserve">Bataguassu</w:t>
+            </w:r>
+          </w:p>
+        </w:tc>
+        <w:tc>
+          <w:tcPr>
+            <w:tcW w:type="dxa" w:w="1171"/>
+            <w:tcMar>
+              <w:top w:type="dxa" w:w="30"/>
+              <w:left w:type="dxa" w:w="70"/>
+              <w:bottom w:type="dxa" w:w="30"/>
+              <w:right w:type="dxa" w:w="70"/>
+            </w:tcMar>
+          </w:tcPr>
+          <w:p>
+            <w:pPr>
+              <w:jc w:val="right"/>
+            </w:pPr>
+            <w:r>
+              <w:rPr>
+                <w:sz w:val="15"/>
+                <w:szCs w:val="15"/>
+                <w:rFonts w:ascii="Calibri" w:cs="Calibri" w:eastAsia="Calibri" w:hAnsi="Calibri"/>
+              </w:rPr>
+              <w:t xml:space="preserve">24</w:t>
+            </w:r>
+          </w:p>
+        </w:tc>
+        <w:tc>
+          <w:tcPr>
+            <w:tcW w:type="dxa" w:w="3707"/>
+            <w:tcMar>
+              <w:top w:type="dxa" w:w="30"/>
+              <w:left w:type="dxa" w:w="70"/>
+              <w:bottom w:type="dxa" w:w="30"/>
+              <w:right w:type="dxa" w:w="70"/>
+            </w:tcMar>
+          </w:tcPr>
+          <w:p>
+            <w:pPr>
+              <w:jc w:val="left"/>
+            </w:pPr>
+            <w:r>
+              <w:rPr>
+                <w:sz w:val="15"/>
+                <w:szCs w:val="15"/>
+                <w:rFonts w:ascii="Calibri" w:cs="Calibri" w:eastAsia="Calibri" w:hAnsi="Calibri"/>
+              </w:rPr>
+              <w:t xml:space="preserve">Mundo Novo</w:t>
+            </w:r>
+          </w:p>
+        </w:tc>
+        <w:tc>
+          <w:tcPr>
+            <w:tcW w:type="dxa" w:w="1171"/>
+            <w:tcMar>
+              <w:top w:type="dxa" w:w="30"/>
+              <w:left w:type="dxa" w:w="70"/>
+              <w:bottom w:type="dxa" w:w="30"/>
+              <w:right w:type="dxa" w:w="70"/>
+            </w:tcMar>
+          </w:tcPr>
+          <w:p>
+            <w:pPr>
+              <w:jc w:val="right"/>
+            </w:pPr>
+            <w:r>
+              <w:rPr>
+                <w:sz w:val="15"/>
+                <w:szCs w:val="15"/>
+                <w:rFonts w:ascii="Calibri" w:cs="Calibri" w:eastAsia="Calibri" w:hAnsi="Calibri"/>
+              </w:rPr>
+              <w:t xml:space="preserve">20</w:t>
+            </w:r>
+          </w:p>
+        </w:tc>
+      </w:tr>
+      <w:tr>
+        <w:trPr>
+          <w:cantSplit/>
+        </w:trPr>
+        <w:tc>
+          <w:tcPr>
+            <w:tcW w:type="dxa" w:w="3707"/>
+            <w:tcMar>
+              <w:top w:type="dxa" w:w="30"/>
+              <w:left w:type="dxa" w:w="70"/>
+              <w:bottom w:type="dxa" w:w="30"/>
+              <w:right w:type="dxa" w:w="70"/>
+            </w:tcMar>
+          </w:tcPr>
+          <w:p>
+            <w:pPr>
+              <w:jc w:val="left"/>
+            </w:pPr>
+            <w:r>
+              <w:rPr>
+                <w:sz w:val="15"/>
+                <w:szCs w:val="15"/>
+                <w:rFonts w:ascii="Calibri" w:cs="Calibri" w:eastAsia="Calibri" w:hAnsi="Calibri"/>
+              </w:rPr>
+              <w:t xml:space="preserve">Batayporã</w:t>
+            </w:r>
+          </w:p>
+        </w:tc>
+        <w:tc>
+          <w:tcPr>
+            <w:tcW w:type="dxa" w:w="1171"/>
+            <w:tcMar>
+              <w:top w:type="dxa" w:w="30"/>
+              <w:left w:type="dxa" w:w="70"/>
+              <w:bottom w:type="dxa" w:w="30"/>
+              <w:right w:type="dxa" w:w="70"/>
+            </w:tcMar>
+          </w:tcPr>
+          <w:p>
+            <w:pPr>
+              <w:jc w:val="right"/>
+            </w:pPr>
+            <w:r>
+              <w:rPr>
+                <w:sz w:val="15"/>
+                <w:szCs w:val="15"/>
+                <w:rFonts w:ascii="Calibri" w:cs="Calibri" w:eastAsia="Calibri" w:hAnsi="Calibri"/>
+              </w:rPr>
+              <w:t xml:space="preserve">22</w:t>
+            </w:r>
+          </w:p>
+        </w:tc>
+        <w:tc>
+          <w:tcPr>
+            <w:tcW w:type="dxa" w:w="3707"/>
+            <w:tcMar>
+              <w:top w:type="dxa" w:w="30"/>
+              <w:left w:type="dxa" w:w="70"/>
+              <w:bottom w:type="dxa" w:w="30"/>
+              <w:right w:type="dxa" w:w="70"/>
+            </w:tcMar>
+          </w:tcPr>
+          <w:p>
+            <w:pPr>
+              <w:jc w:val="left"/>
+            </w:pPr>
+            <w:r>
+              <w:rPr>
+                <w:sz w:val="15"/>
+                <w:szCs w:val="15"/>
+                <w:rFonts w:ascii="Calibri" w:cs="Calibri" w:eastAsia="Calibri" w:hAnsi="Calibri"/>
+              </w:rPr>
+              <w:t xml:space="preserve">Naviraí</w:t>
+            </w:r>
+          </w:p>
+        </w:tc>
+        <w:tc>
+          <w:tcPr>
+            <w:tcW w:type="dxa" w:w="1171"/>
+            <w:tcMar>
+              <w:top w:type="dxa" w:w="30"/>
+              <w:left w:type="dxa" w:w="70"/>
+              <w:bottom w:type="dxa" w:w="30"/>
+              <w:right w:type="dxa" w:w="70"/>
+            </w:tcMar>
+          </w:tcPr>
+          <w:p>
+            <w:pPr>
+              <w:jc w:val="right"/>
+            </w:pPr>
+            <w:r>
+              <w:rPr>
+                <w:sz w:val="15"/>
+                <w:szCs w:val="15"/>
+                <w:rFonts w:ascii="Calibri" w:cs="Calibri" w:eastAsia="Calibri" w:hAnsi="Calibri"/>
+              </w:rPr>
+              <w:t xml:space="preserve">24</w:t>
+            </w:r>
+          </w:p>
+        </w:tc>
+      </w:tr>
+      <w:tr>
+        <w:trPr>
+          <w:cantSplit/>
+        </w:trPr>
+        <w:tc>
+          <w:tcPr>
+            <w:tcW w:type="dxa" w:w="3707"/>
+            <w:tcMar>
+              <w:top w:type="dxa" w:w="30"/>
+              <w:left w:type="dxa" w:w="70"/>
+              <w:bottom w:type="dxa" w:w="30"/>
+              <w:right w:type="dxa" w:w="70"/>
+            </w:tcMar>
+          </w:tcPr>
+          <w:p>
+            <w:pPr>
+              <w:jc w:val="left"/>
+            </w:pPr>
+            <w:r>
+              <w:rPr>
+                <w:sz w:val="15"/>
+                <w:szCs w:val="15"/>
+                <w:rFonts w:ascii="Calibri" w:cs="Calibri" w:eastAsia="Calibri" w:hAnsi="Calibri"/>
+              </w:rPr>
+              <w:t xml:space="preserve">Bela Vista</w:t>
+            </w:r>
+          </w:p>
+        </w:tc>
+        <w:tc>
+          <w:tcPr>
+            <w:tcW w:type="dxa" w:w="1171"/>
+            <w:tcMar>
+              <w:top w:type="dxa" w:w="30"/>
+              <w:left w:type="dxa" w:w="70"/>
+              <w:bottom w:type="dxa" w:w="30"/>
+              <w:right w:type="dxa" w:w="70"/>
+            </w:tcMar>
+          </w:tcPr>
+          <w:p>
+            <w:pPr>
+              <w:jc w:val="right"/>
+            </w:pPr>
+            <w:r>
+              <w:rPr>
+                <w:sz w:val="15"/>
+                <w:szCs w:val="15"/>
+                <w:rFonts w:ascii="Calibri" w:cs="Calibri" w:eastAsia="Calibri" w:hAnsi="Calibri"/>
+              </w:rPr>
+              <w:t xml:space="preserve">30</w:t>
+            </w:r>
+          </w:p>
+        </w:tc>
+        <w:tc>
+          <w:tcPr>
+            <w:tcW w:type="dxa" w:w="3707"/>
+            <w:tcMar>
+              <w:top w:type="dxa" w:w="30"/>
+              <w:left w:type="dxa" w:w="70"/>
+              <w:bottom w:type="dxa" w:w="30"/>
+              <w:right w:type="dxa" w:w="70"/>
+            </w:tcMar>
+          </w:tcPr>
+          <w:p>
+            <w:pPr>
+              <w:jc w:val="left"/>
+            </w:pPr>
+            <w:r>
+              <w:rPr>
+                <w:sz w:val="15"/>
+                <w:szCs w:val="15"/>
+                <w:rFonts w:ascii="Calibri" w:cs="Calibri" w:eastAsia="Calibri" w:hAnsi="Calibri"/>
+              </w:rPr>
+              <w:t xml:space="preserve">Nioaque</w:t>
+            </w:r>
+          </w:p>
+        </w:tc>
+        <w:tc>
+          <w:tcPr>
+            <w:tcW w:type="dxa" w:w="1171"/>
+            <w:tcMar>
+              <w:top w:type="dxa" w:w="30"/>
+              <w:left w:type="dxa" w:w="70"/>
+              <w:bottom w:type="dxa" w:w="30"/>
+              <w:right w:type="dxa" w:w="70"/>
+            </w:tcMar>
+          </w:tcPr>
+          <w:p>
+            <w:pPr>
+              <w:jc w:val="right"/>
+            </w:pPr>
+            <w:r>
+              <w:rPr>
+                <w:sz w:val="15"/>
+                <w:szCs w:val="15"/>
+                <w:rFonts w:ascii="Calibri" w:cs="Calibri" w:eastAsia="Calibri" w:hAnsi="Calibri"/>
+              </w:rPr>
+              <w:t xml:space="preserve">24</w:t>
+            </w:r>
+          </w:p>
+        </w:tc>
+      </w:tr>
+      <w:tr>
+        <w:trPr>
+          <w:cantSplit/>
+        </w:trPr>
+        <w:tc>
+          <w:tcPr>
+            <w:tcW w:type="dxa" w:w="3707"/>
+            <w:tcMar>
+              <w:top w:type="dxa" w:w="30"/>
+              <w:left w:type="dxa" w:w="70"/>
+              <w:bottom w:type="dxa" w:w="30"/>
+              <w:right w:type="dxa" w:w="70"/>
+            </w:tcMar>
+          </w:tcPr>
+          <w:p>
+            <w:pPr>
+              <w:jc w:val="left"/>
+            </w:pPr>
+            <w:r>
+              <w:rPr>
+                <w:sz w:val="15"/>
+                <w:szCs w:val="15"/>
+                <w:rFonts w:ascii="Calibri" w:cs="Calibri" w:eastAsia="Calibri" w:hAnsi="Calibri"/>
+              </w:rPr>
+              <w:t xml:space="preserve">Bodoquena</w:t>
+            </w:r>
+          </w:p>
+        </w:tc>
+        <w:tc>
+          <w:tcPr>
+            <w:tcW w:type="dxa" w:w="1171"/>
+            <w:tcMar>
+              <w:top w:type="dxa" w:w="30"/>
+              <w:left w:type="dxa" w:w="70"/>
+              <w:bottom w:type="dxa" w:w="30"/>
+              <w:right w:type="dxa" w:w="70"/>
+            </w:tcMar>
+          </w:tcPr>
+          <w:p>
+            <w:pPr>
+              <w:jc w:val="right"/>
+            </w:pPr>
+            <w:r>
+              <w:rPr>
+                <w:sz w:val="15"/>
+                <w:szCs w:val="15"/>
+                <w:rFonts w:ascii="Calibri" w:cs="Calibri" w:eastAsia="Calibri" w:hAnsi="Calibri"/>
+              </w:rPr>
+              <w:t xml:space="preserve">22</w:t>
+            </w:r>
+          </w:p>
+        </w:tc>
+        <w:tc>
+          <w:tcPr>
+            <w:tcW w:type="dxa" w:w="3707"/>
+            <w:tcMar>
+              <w:top w:type="dxa" w:w="30"/>
+              <w:left w:type="dxa" w:w="70"/>
+              <w:bottom w:type="dxa" w:w="30"/>
+              <w:right w:type="dxa" w:w="70"/>
+            </w:tcMar>
+          </w:tcPr>
+          <w:p>
+            <w:pPr>
+              <w:jc w:val="left"/>
+            </w:pPr>
+            <w:r>
+              <w:rPr>
+                <w:sz w:val="15"/>
+                <w:szCs w:val="15"/>
+                <w:rFonts w:ascii="Calibri" w:cs="Calibri" w:eastAsia="Calibri" w:hAnsi="Calibri"/>
+              </w:rPr>
+              <w:t xml:space="preserve">Nova Alvorada do Sul</w:t>
+            </w:r>
+          </w:p>
+        </w:tc>
+        <w:tc>
+          <w:tcPr>
+            <w:tcW w:type="dxa" w:w="1171"/>
+            <w:tcMar>
+              <w:top w:type="dxa" w:w="30"/>
+              <w:left w:type="dxa" w:w="70"/>
+              <w:bottom w:type="dxa" w:w="30"/>
+              <w:right w:type="dxa" w:w="70"/>
+            </w:tcMar>
+          </w:tcPr>
+          <w:p>
+            <w:pPr>
+              <w:jc w:val="right"/>
+            </w:pPr>
+            <w:r>
+              <w:rPr>
+                <w:sz w:val="15"/>
+                <w:szCs w:val="15"/>
+                <w:rFonts w:ascii="Calibri" w:cs="Calibri" w:eastAsia="Calibri" w:hAnsi="Calibri"/>
+              </w:rPr>
+              <w:t xml:space="preserve">28</w:t>
+            </w:r>
+          </w:p>
+        </w:tc>
+      </w:tr>
+      <w:tr>
+        <w:trPr>
+          <w:cantSplit/>
+        </w:trPr>
+        <w:tc>
+          <w:tcPr>
+            <w:tcW w:type="dxa" w:w="3707"/>
+            <w:tcMar>
+              <w:top w:type="dxa" w:w="30"/>
+              <w:left w:type="dxa" w:w="70"/>
+              <w:bottom w:type="dxa" w:w="30"/>
+              <w:right w:type="dxa" w:w="70"/>
+            </w:tcMar>
+          </w:tcPr>
+          <w:p>
+            <w:pPr>
+              <w:jc w:val="left"/>
+            </w:pPr>
+            <w:r>
+              <w:rPr>
+                <w:sz w:val="15"/>
+                <w:szCs w:val="15"/>
+                <w:rFonts w:ascii="Calibri" w:cs="Calibri" w:eastAsia="Calibri" w:hAnsi="Calibri"/>
+              </w:rPr>
+              <w:t xml:space="preserve">Bonito</w:t>
+            </w:r>
+          </w:p>
+        </w:tc>
+        <w:tc>
+          <w:tcPr>
+            <w:tcW w:type="dxa" w:w="1171"/>
+            <w:tcMar>
+              <w:top w:type="dxa" w:w="30"/>
+              <w:left w:type="dxa" w:w="70"/>
+              <w:bottom w:type="dxa" w:w="30"/>
+              <w:right w:type="dxa" w:w="70"/>
+            </w:tcMar>
+          </w:tcPr>
+          <w:p>
+            <w:pPr>
+              <w:jc w:val="right"/>
+            </w:pPr>
+            <w:r>
+              <w:rPr>
+                <w:sz w:val="15"/>
+                <w:szCs w:val="15"/>
+                <w:rFonts w:ascii="Calibri" w:cs="Calibri" w:eastAsia="Calibri" w:hAnsi="Calibri"/>
+              </w:rPr>
+              <w:t xml:space="preserve">22</w:t>
+            </w:r>
+          </w:p>
+        </w:tc>
+        <w:tc>
+          <w:tcPr>
+            <w:tcW w:type="dxa" w:w="3707"/>
+            <w:tcMar>
+              <w:top w:type="dxa" w:w="30"/>
+              <w:left w:type="dxa" w:w="70"/>
+              <w:bottom w:type="dxa" w:w="30"/>
+              <w:right w:type="dxa" w:w="70"/>
+            </w:tcMar>
+          </w:tcPr>
+          <w:p>
+            <w:pPr>
+              <w:jc w:val="left"/>
+            </w:pPr>
+            <w:r>
+              <w:rPr>
+                <w:sz w:val="15"/>
+                <w:szCs w:val="15"/>
+                <w:rFonts w:ascii="Calibri" w:cs="Calibri" w:eastAsia="Calibri" w:hAnsi="Calibri"/>
+              </w:rPr>
+              <w:t xml:space="preserve">Nova Andradina</w:t>
+            </w:r>
+          </w:p>
+        </w:tc>
+        <w:tc>
+          <w:tcPr>
+            <w:tcW w:type="dxa" w:w="1171"/>
+            <w:tcMar>
+              <w:top w:type="dxa" w:w="30"/>
+              <w:left w:type="dxa" w:w="70"/>
+              <w:bottom w:type="dxa" w:w="30"/>
+              <w:right w:type="dxa" w:w="70"/>
+            </w:tcMar>
+          </w:tcPr>
+          <w:p>
+            <w:pPr>
+              <w:jc w:val="right"/>
+            </w:pPr>
+            <w:r>
+              <w:rPr>
+                <w:sz w:val="15"/>
+                <w:szCs w:val="15"/>
+                <w:rFonts w:ascii="Calibri" w:cs="Calibri" w:eastAsia="Calibri" w:hAnsi="Calibri"/>
+              </w:rPr>
+              <w:t xml:space="preserve">26</w:t>
+            </w:r>
+          </w:p>
+        </w:tc>
+      </w:tr>
+      <w:tr>
+        <w:trPr>
+          <w:cantSplit/>
+        </w:trPr>
+        <w:tc>
+          <w:tcPr>
+            <w:tcW w:type="dxa" w:w="3707"/>
+            <w:tcMar>
+              <w:top w:type="dxa" w:w="30"/>
+              <w:left w:type="dxa" w:w="70"/>
+              <w:bottom w:type="dxa" w:w="30"/>
+              <w:right w:type="dxa" w:w="70"/>
+            </w:tcMar>
+          </w:tcPr>
+          <w:p>
+            <w:pPr>
+              <w:jc w:val="left"/>
+            </w:pPr>
+            <w:r>
+              <w:rPr>
+                <w:sz w:val="15"/>
+                <w:szCs w:val="15"/>
+                <w:rFonts w:ascii="Calibri" w:cs="Calibri" w:eastAsia="Calibri" w:hAnsi="Calibri"/>
+              </w:rPr>
+              <w:t xml:space="preserve">Brasilândia</w:t>
+            </w:r>
+          </w:p>
+        </w:tc>
+        <w:tc>
+          <w:tcPr>
+            <w:tcW w:type="dxa" w:w="1171"/>
+            <w:tcMar>
+              <w:top w:type="dxa" w:w="30"/>
+              <w:left w:type="dxa" w:w="70"/>
+              <w:bottom w:type="dxa" w:w="30"/>
+              <w:right w:type="dxa" w:w="70"/>
+            </w:tcMar>
+          </w:tcPr>
+          <w:p>
+            <w:pPr>
+              <w:jc w:val="right"/>
+            </w:pPr>
+            <w:r>
+              <w:rPr>
+                <w:sz w:val="15"/>
+                <w:szCs w:val="15"/>
+                <w:rFonts w:ascii="Calibri" w:cs="Calibri" w:eastAsia="Calibri" w:hAnsi="Calibri"/>
+              </w:rPr>
+              <w:t xml:space="preserve">26</w:t>
+            </w:r>
+          </w:p>
+        </w:tc>
+        <w:tc>
+          <w:tcPr>
+            <w:tcW w:type="dxa" w:w="3707"/>
+            <w:tcMar>
+              <w:top w:type="dxa" w:w="30"/>
+              <w:left w:type="dxa" w:w="70"/>
+              <w:bottom w:type="dxa" w:w="30"/>
+              <w:right w:type="dxa" w:w="70"/>
+            </w:tcMar>
+          </w:tcPr>
+          <w:p>
+            <w:pPr>
+              <w:jc w:val="left"/>
+            </w:pPr>
+            <w:r>
+              <w:rPr>
+                <w:sz w:val="15"/>
+                <w:szCs w:val="15"/>
+                <w:rFonts w:ascii="Calibri" w:cs="Calibri" w:eastAsia="Calibri" w:hAnsi="Calibri"/>
+              </w:rPr>
+              <w:t xml:space="preserve">Novo Horizonte do Sul</w:t>
+            </w:r>
+          </w:p>
+        </w:tc>
+        <w:tc>
+          <w:tcPr>
+            <w:tcW w:type="dxa" w:w="1171"/>
+            <w:tcMar>
+              <w:top w:type="dxa" w:w="30"/>
+              <w:left w:type="dxa" w:w="70"/>
+              <w:bottom w:type="dxa" w:w="30"/>
+              <w:right w:type="dxa" w:w="70"/>
+            </w:tcMar>
+          </w:tcPr>
+          <w:p>
+            <w:pPr>
+              <w:jc w:val="right"/>
+            </w:pPr>
+            <w:r>
+              <w:rPr>
+                <w:sz w:val="15"/>
+                <w:szCs w:val="15"/>
+                <w:rFonts w:ascii="Calibri" w:cs="Calibri" w:eastAsia="Calibri" w:hAnsi="Calibri"/>
+              </w:rPr>
+              <w:t xml:space="preserve">22</w:t>
+            </w:r>
+          </w:p>
+        </w:tc>
+      </w:tr>
+      <w:tr>
+        <w:trPr>
+          <w:cantSplit/>
+        </w:trPr>
+        <w:tc>
+          <w:tcPr>
+            <w:tcW w:type="dxa" w:w="3707"/>
+            <w:tcMar>
+              <w:top w:type="dxa" w:w="30"/>
+              <w:left w:type="dxa" w:w="70"/>
+              <w:bottom w:type="dxa" w:w="30"/>
+              <w:right w:type="dxa" w:w="70"/>
+            </w:tcMar>
+          </w:tcPr>
+          <w:p>
+            <w:pPr>
+              <w:jc w:val="left"/>
+            </w:pPr>
+            <w:r>
+              <w:rPr>
+                <w:sz w:val="15"/>
+                <w:szCs w:val="15"/>
+                <w:rFonts w:ascii="Calibri" w:cs="Calibri" w:eastAsia="Calibri" w:hAnsi="Calibri"/>
+              </w:rPr>
+              <w:t xml:space="preserve">Caarapó</w:t>
+            </w:r>
+          </w:p>
+        </w:tc>
+        <w:tc>
+          <w:tcPr>
+            <w:tcW w:type="dxa" w:w="1171"/>
+            <w:tcMar>
+              <w:top w:type="dxa" w:w="30"/>
+              <w:left w:type="dxa" w:w="70"/>
+              <w:bottom w:type="dxa" w:w="30"/>
+              <w:right w:type="dxa" w:w="70"/>
+            </w:tcMar>
+          </w:tcPr>
+          <w:p>
+            <w:pPr>
+              <w:jc w:val="right"/>
+            </w:pPr>
+            <w:r>
+              <w:rPr>
+                <w:sz w:val="15"/>
+                <w:szCs w:val="15"/>
+                <w:rFonts w:ascii="Calibri" w:cs="Calibri" w:eastAsia="Calibri" w:hAnsi="Calibri"/>
+              </w:rPr>
+              <w:t xml:space="preserve">24</w:t>
+            </w:r>
+          </w:p>
+        </w:tc>
+        <w:tc>
+          <w:tcPr>
+            <w:tcW w:type="dxa" w:w="3707"/>
+            <w:tcMar>
+              <w:top w:type="dxa" w:w="30"/>
+              <w:left w:type="dxa" w:w="70"/>
+              <w:bottom w:type="dxa" w:w="30"/>
+              <w:right w:type="dxa" w:w="70"/>
+            </w:tcMar>
+          </w:tcPr>
+          <w:p>
+            <w:pPr>
+              <w:jc w:val="left"/>
+            </w:pPr>
+            <w:r>
+              <w:rPr>
+                <w:sz w:val="15"/>
+                <w:szCs w:val="15"/>
+                <w:rFonts w:ascii="Calibri" w:cs="Calibri" w:eastAsia="Calibri" w:hAnsi="Calibri"/>
+              </w:rPr>
+              <w:t xml:space="preserve">Paraíso das Águas</w:t>
+            </w:r>
+          </w:p>
+        </w:tc>
+        <w:tc>
+          <w:tcPr>
+            <w:tcW w:type="dxa" w:w="1171"/>
+            <w:tcMar>
+              <w:top w:type="dxa" w:w="30"/>
+              <w:left w:type="dxa" w:w="70"/>
+              <w:bottom w:type="dxa" w:w="30"/>
+              <w:right w:type="dxa" w:w="70"/>
+            </w:tcMar>
+          </w:tcPr>
+          <w:p>
+            <w:pPr>
+              <w:jc w:val="right"/>
+            </w:pPr>
+            <w:r>
+              <w:rPr>
+                <w:sz w:val="15"/>
+                <w:szCs w:val="15"/>
+                <w:rFonts w:ascii="Calibri" w:cs="Calibri" w:eastAsia="Calibri" w:hAnsi="Calibri"/>
+              </w:rPr>
+              <w:t xml:space="preserve">24</w:t>
+            </w:r>
+          </w:p>
+        </w:tc>
+      </w:tr>
+      <w:tr>
+        <w:trPr>
+          <w:cantSplit/>
+        </w:trPr>
+        <w:tc>
+          <w:tcPr>
+            <w:tcW w:type="dxa" w:w="3707"/>
+            <w:tcMar>
+              <w:top w:type="dxa" w:w="30"/>
+              <w:left w:type="dxa" w:w="70"/>
+              <w:bottom w:type="dxa" w:w="30"/>
+              <w:right w:type="dxa" w:w="70"/>
+            </w:tcMar>
+          </w:tcPr>
+          <w:p>
+            <w:pPr>
+              <w:jc w:val="left"/>
+            </w:pPr>
+            <w:r>
+              <w:rPr>
+                <w:sz w:val="15"/>
+                <w:szCs w:val="15"/>
+                <w:rFonts w:ascii="Calibri" w:cs="Calibri" w:eastAsia="Calibri" w:hAnsi="Calibri"/>
+              </w:rPr>
+              <w:t xml:space="preserve">Camapuã</w:t>
+            </w:r>
+          </w:p>
+        </w:tc>
+        <w:tc>
+          <w:tcPr>
+            <w:tcW w:type="dxa" w:w="1171"/>
+            <w:tcMar>
+              <w:top w:type="dxa" w:w="30"/>
+              <w:left w:type="dxa" w:w="70"/>
+              <w:bottom w:type="dxa" w:w="30"/>
+              <w:right w:type="dxa" w:w="70"/>
+            </w:tcMar>
+          </w:tcPr>
+          <w:p>
+            <w:pPr>
+              <w:jc w:val="right"/>
+            </w:pPr>
+            <w:r>
+              <w:rPr>
+                <w:sz w:val="15"/>
+                <w:szCs w:val="15"/>
+                <w:rFonts w:ascii="Calibri" w:cs="Calibri" w:eastAsia="Calibri" w:hAnsi="Calibri"/>
+              </w:rPr>
+              <w:t xml:space="preserve">22</w:t>
+            </w:r>
+          </w:p>
+        </w:tc>
+        <w:tc>
+          <w:tcPr>
+            <w:tcW w:type="dxa" w:w="3707"/>
+            <w:tcMar>
+              <w:top w:type="dxa" w:w="30"/>
+              <w:left w:type="dxa" w:w="70"/>
+              <w:bottom w:type="dxa" w:w="30"/>
+              <w:right w:type="dxa" w:w="70"/>
+            </w:tcMar>
+          </w:tcPr>
+          <w:p>
+            <w:pPr>
+              <w:jc w:val="left"/>
+            </w:pPr>
+            <w:r>
+              <w:rPr>
+                <w:sz w:val="15"/>
+                <w:szCs w:val="15"/>
+                <w:rFonts w:ascii="Calibri" w:cs="Calibri" w:eastAsia="Calibri" w:hAnsi="Calibri"/>
+              </w:rPr>
+              <w:t xml:space="preserve">Paranaíba</w:t>
+            </w:r>
+          </w:p>
+        </w:tc>
+        <w:tc>
+          <w:tcPr>
+            <w:tcW w:type="dxa" w:w="1171"/>
+            <w:tcMar>
+              <w:top w:type="dxa" w:w="30"/>
+              <w:left w:type="dxa" w:w="70"/>
+              <w:bottom w:type="dxa" w:w="30"/>
+              <w:right w:type="dxa" w:w="70"/>
+            </w:tcMar>
+          </w:tcPr>
+          <w:p>
+            <w:pPr>
+              <w:jc w:val="right"/>
+            </w:pPr>
+            <w:r>
+              <w:rPr>
+                <w:sz w:val="15"/>
+                <w:szCs w:val="15"/>
+                <w:rFonts w:ascii="Calibri" w:cs="Calibri" w:eastAsia="Calibri" w:hAnsi="Calibri"/>
+              </w:rPr>
+              <w:t xml:space="preserve">18</w:t>
+            </w:r>
+          </w:p>
+        </w:tc>
+      </w:tr>
+      <w:tr>
+        <w:trPr>
+          <w:cantSplit/>
+        </w:trPr>
+        <w:tc>
+          <w:tcPr>
+            <w:tcW w:type="dxa" w:w="3707"/>
+            <w:tcMar>
+              <w:top w:type="dxa" w:w="30"/>
+              <w:left w:type="dxa" w:w="70"/>
+              <w:bottom w:type="dxa" w:w="30"/>
+              <w:right w:type="dxa" w:w="70"/>
+            </w:tcMar>
+          </w:tcPr>
+          <w:p>
+            <w:pPr>
+              <w:jc w:val="left"/>
+            </w:pPr>
+            <w:r>
+              <w:rPr>
+                <w:sz w:val="15"/>
+                <w:szCs w:val="15"/>
+                <w:rFonts w:ascii="Calibri" w:cs="Calibri" w:eastAsia="Calibri" w:hAnsi="Calibri"/>
+              </w:rPr>
+              <w:t xml:space="preserve">Campo Grande (adotado)</w:t>
+            </w:r>
+          </w:p>
+        </w:tc>
+        <w:tc>
+          <w:tcPr>
+            <w:tcW w:type="dxa" w:w="1171"/>
+            <w:tcMar>
+              <w:top w:type="dxa" w:w="30"/>
+              <w:left w:type="dxa" w:w="70"/>
+              <w:bottom w:type="dxa" w:w="30"/>
+              <w:right w:type="dxa" w:w="70"/>
+            </w:tcMar>
+          </w:tcPr>
+          <w:p>
+            <w:pPr>
+              <w:jc w:val="right"/>
+            </w:pPr>
+            <w:r>
+              <w:rPr>
+                <w:sz w:val="15"/>
+                <w:szCs w:val="15"/>
+                <w:rFonts w:ascii="Calibri" w:cs="Calibri" w:eastAsia="Calibri" w:hAnsi="Calibri"/>
+              </w:rPr>
+              <w:t xml:space="preserve">30</w:t>
+            </w:r>
+          </w:p>
+        </w:tc>
+        <w:tc>
+          <w:tcPr>
+            <w:tcW w:type="dxa" w:w="3707"/>
+            <w:tcMar>
+              <w:top w:type="dxa" w:w="30"/>
+              <w:left w:type="dxa" w:w="70"/>
+              <w:bottom w:type="dxa" w:w="30"/>
+              <w:right w:type="dxa" w:w="70"/>
+            </w:tcMar>
+          </w:tcPr>
+          <w:p>
+            <w:pPr>
+              <w:jc w:val="left"/>
+            </w:pPr>
+            <w:r>
+              <w:rPr>
+                <w:sz w:val="15"/>
+                <w:szCs w:val="15"/>
+                <w:rFonts w:ascii="Calibri" w:cs="Calibri" w:eastAsia="Calibri" w:hAnsi="Calibri"/>
+              </w:rPr>
+              <w:t xml:space="preserve">Paranhos</w:t>
+            </w:r>
+          </w:p>
+        </w:tc>
+        <w:tc>
+          <w:tcPr>
+            <w:tcW w:type="dxa" w:w="1171"/>
+            <w:tcMar>
+              <w:top w:type="dxa" w:w="30"/>
+              <w:left w:type="dxa" w:w="70"/>
+              <w:bottom w:type="dxa" w:w="30"/>
+              <w:right w:type="dxa" w:w="70"/>
+            </w:tcMar>
+          </w:tcPr>
+          <w:p>
+            <w:pPr>
+              <w:jc w:val="right"/>
+            </w:pPr>
+            <w:r>
+              <w:rPr>
+                <w:sz w:val="15"/>
+                <w:szCs w:val="15"/>
+                <w:rFonts w:ascii="Calibri" w:cs="Calibri" w:eastAsia="Calibri" w:hAnsi="Calibri"/>
+              </w:rPr>
+              <w:t xml:space="preserve">22</w:t>
+            </w:r>
+          </w:p>
+        </w:tc>
+      </w:tr>
+      <w:tr>
+        <w:trPr>
+          <w:cantSplit/>
+        </w:trPr>
+        <w:tc>
+          <w:tcPr>
+            <w:tcW w:type="dxa" w:w="3707"/>
+            <w:tcMar>
+              <w:top w:type="dxa" w:w="30"/>
+              <w:left w:type="dxa" w:w="70"/>
+              <w:bottom w:type="dxa" w:w="30"/>
+              <w:right w:type="dxa" w:w="70"/>
+            </w:tcMar>
+          </w:tcPr>
+          <w:p>
+            <w:pPr>
+              <w:jc w:val="left"/>
+            </w:pPr>
+            <w:r>
+              <w:rPr>
+                <w:sz w:val="15"/>
+                <w:szCs w:val="15"/>
+                <w:rFonts w:ascii="Calibri" w:cs="Calibri" w:eastAsia="Calibri" w:hAnsi="Calibri"/>
+              </w:rPr>
+              <w:t xml:space="preserve">Caracol</w:t>
+            </w:r>
+          </w:p>
+        </w:tc>
+        <w:tc>
+          <w:tcPr>
+            <w:tcW w:type="dxa" w:w="1171"/>
+            <w:tcMar>
+              <w:top w:type="dxa" w:w="30"/>
+              <w:left w:type="dxa" w:w="70"/>
+              <w:bottom w:type="dxa" w:w="30"/>
+              <w:right w:type="dxa" w:w="70"/>
+            </w:tcMar>
+          </w:tcPr>
+          <w:p>
+            <w:pPr>
+              <w:jc w:val="right"/>
+            </w:pPr>
+            <w:r>
+              <w:rPr>
+                <w:sz w:val="15"/>
+                <w:szCs w:val="15"/>
+                <w:rFonts w:ascii="Calibri" w:cs="Calibri" w:eastAsia="Calibri" w:hAnsi="Calibri"/>
+              </w:rPr>
+              <w:t xml:space="preserve">26</w:t>
+            </w:r>
+          </w:p>
+        </w:tc>
+        <w:tc>
+          <w:tcPr>
+            <w:tcW w:type="dxa" w:w="3707"/>
+            <w:tcMar>
+              <w:top w:type="dxa" w:w="30"/>
+              <w:left w:type="dxa" w:w="70"/>
+              <w:bottom w:type="dxa" w:w="30"/>
+              <w:right w:type="dxa" w:w="70"/>
+            </w:tcMar>
+          </w:tcPr>
+          <w:p>
+            <w:pPr>
+              <w:jc w:val="left"/>
+            </w:pPr>
+            <w:r>
+              <w:rPr>
+                <w:sz w:val="15"/>
+                <w:szCs w:val="15"/>
+                <w:rFonts w:ascii="Calibri" w:cs="Calibri" w:eastAsia="Calibri" w:hAnsi="Calibri"/>
+              </w:rPr>
+              <w:t xml:space="preserve">Pedro Gomes</w:t>
+            </w:r>
+          </w:p>
+        </w:tc>
+        <w:tc>
+          <w:tcPr>
+            <w:tcW w:type="dxa" w:w="1171"/>
+            <w:tcMar>
+              <w:top w:type="dxa" w:w="30"/>
+              <w:left w:type="dxa" w:w="70"/>
+              <w:bottom w:type="dxa" w:w="30"/>
+              <w:right w:type="dxa" w:w="70"/>
+            </w:tcMar>
+          </w:tcPr>
+          <w:p>
+            <w:pPr>
+              <w:jc w:val="right"/>
+            </w:pPr>
+            <w:r>
+              <w:rPr>
+                <w:sz w:val="15"/>
+                <w:szCs w:val="15"/>
+                <w:rFonts w:ascii="Calibri" w:cs="Calibri" w:eastAsia="Calibri" w:hAnsi="Calibri"/>
+              </w:rPr>
+              <w:t xml:space="preserve">24</w:t>
+            </w:r>
+          </w:p>
+        </w:tc>
+      </w:tr>
+      <w:tr>
+        <w:trPr>
+          <w:cantSplit/>
+        </w:trPr>
+        <w:tc>
+          <w:tcPr>
+            <w:tcW w:type="dxa" w:w="3707"/>
+            <w:tcMar>
+              <w:top w:type="dxa" w:w="30"/>
+              <w:left w:type="dxa" w:w="70"/>
+              <w:bottom w:type="dxa" w:w="30"/>
+              <w:right w:type="dxa" w:w="70"/>
+            </w:tcMar>
+          </w:tcPr>
+          <w:p>
+            <w:pPr>
+              <w:jc w:val="left"/>
+            </w:pPr>
+            <w:r>
+              <w:rPr>
+                <w:sz w:val="15"/>
+                <w:szCs w:val="15"/>
+                <w:rFonts w:ascii="Calibri" w:cs="Calibri" w:eastAsia="Calibri" w:hAnsi="Calibri"/>
+              </w:rPr>
+              <w:t xml:space="preserve">Cassilândia</w:t>
+            </w:r>
+          </w:p>
+        </w:tc>
+        <w:tc>
+          <w:tcPr>
+            <w:tcW w:type="dxa" w:w="1171"/>
+            <w:tcMar>
+              <w:top w:type="dxa" w:w="30"/>
+              <w:left w:type="dxa" w:w="70"/>
+              <w:bottom w:type="dxa" w:w="30"/>
+              <w:right w:type="dxa" w:w="70"/>
+            </w:tcMar>
+          </w:tcPr>
+          <w:p>
+            <w:pPr>
+              <w:jc w:val="right"/>
+            </w:pPr>
+            <w:r>
+              <w:rPr>
+                <w:sz w:val="15"/>
+                <w:szCs w:val="15"/>
+                <w:rFonts w:ascii="Calibri" w:cs="Calibri" w:eastAsia="Calibri" w:hAnsi="Calibri"/>
+              </w:rPr>
+              <w:t xml:space="preserve">20</w:t>
+            </w:r>
+          </w:p>
+        </w:tc>
+        <w:tc>
+          <w:tcPr>
+            <w:tcW w:type="dxa" w:w="3707"/>
+            <w:tcMar>
+              <w:top w:type="dxa" w:w="30"/>
+              <w:left w:type="dxa" w:w="70"/>
+              <w:bottom w:type="dxa" w:w="30"/>
+              <w:right w:type="dxa" w:w="70"/>
+            </w:tcMar>
+          </w:tcPr>
+          <w:p>
+            <w:pPr>
+              <w:jc w:val="left"/>
+            </w:pPr>
+            <w:r>
+              <w:rPr>
+                <w:sz w:val="15"/>
+                <w:szCs w:val="15"/>
+                <w:rFonts w:ascii="Calibri" w:cs="Calibri" w:eastAsia="Calibri" w:hAnsi="Calibri"/>
+              </w:rPr>
+              <w:t xml:space="preserve">Ponta Porã</w:t>
+            </w:r>
+          </w:p>
+        </w:tc>
+        <w:tc>
+          <w:tcPr>
+            <w:tcW w:type="dxa" w:w="1171"/>
+            <w:tcMar>
+              <w:top w:type="dxa" w:w="30"/>
+              <w:left w:type="dxa" w:w="70"/>
+              <w:bottom w:type="dxa" w:w="30"/>
+              <w:right w:type="dxa" w:w="70"/>
+            </w:tcMar>
+          </w:tcPr>
+          <w:p>
+            <w:pPr>
+              <w:jc w:val="right"/>
+            </w:pPr>
+            <w:r>
+              <w:rPr>
+                <w:sz w:val="15"/>
+                <w:szCs w:val="15"/>
+                <w:rFonts w:ascii="Calibri" w:cs="Calibri" w:eastAsia="Calibri" w:hAnsi="Calibri"/>
+              </w:rPr>
+              <w:t xml:space="preserve">26</w:t>
+            </w:r>
+          </w:p>
+        </w:tc>
+      </w:tr>
+      <w:tr>
+        <w:trPr>
+          <w:cantSplit/>
+        </w:trPr>
+        <w:tc>
+          <w:tcPr>
+            <w:tcW w:type="dxa" w:w="3707"/>
+            <w:tcMar>
+              <w:top w:type="dxa" w:w="30"/>
+              <w:left w:type="dxa" w:w="70"/>
+              <w:bottom w:type="dxa" w:w="30"/>
+              <w:right w:type="dxa" w:w="70"/>
+            </w:tcMar>
+          </w:tcPr>
+          <w:p>
+            <w:pPr>
+              <w:jc w:val="left"/>
+            </w:pPr>
+            <w:r>
+              <w:rPr>
+                <w:sz w:val="15"/>
+                <w:szCs w:val="15"/>
+                <w:rFonts w:ascii="Calibri" w:cs="Calibri" w:eastAsia="Calibri" w:hAnsi="Calibri"/>
+              </w:rPr>
+              <w:t xml:space="preserve">Chapadão do Sul</w:t>
+            </w:r>
+          </w:p>
+        </w:tc>
+        <w:tc>
+          <w:tcPr>
+            <w:tcW w:type="dxa" w:w="1171"/>
+            <w:tcMar>
+              <w:top w:type="dxa" w:w="30"/>
+              <w:left w:type="dxa" w:w="70"/>
+              <w:bottom w:type="dxa" w:w="30"/>
+              <w:right w:type="dxa" w:w="70"/>
+            </w:tcMar>
+          </w:tcPr>
+          <w:p>
+            <w:pPr>
+              <w:jc w:val="right"/>
+            </w:pPr>
+            <w:r>
+              <w:rPr>
+                <w:sz w:val="15"/>
+                <w:szCs w:val="15"/>
+                <w:rFonts w:ascii="Calibri" w:cs="Calibri" w:eastAsia="Calibri" w:hAnsi="Calibri"/>
+              </w:rPr>
+              <w:t xml:space="preserve">24</w:t>
+            </w:r>
+          </w:p>
+        </w:tc>
+        <w:tc>
+          <w:tcPr>
+            <w:tcW w:type="dxa" w:w="3707"/>
+            <w:tcMar>
+              <w:top w:type="dxa" w:w="30"/>
+              <w:left w:type="dxa" w:w="70"/>
+              <w:bottom w:type="dxa" w:w="30"/>
+              <w:right w:type="dxa" w:w="70"/>
+            </w:tcMar>
+          </w:tcPr>
+          <w:p>
+            <w:pPr>
+              <w:jc w:val="left"/>
+            </w:pPr>
+            <w:r>
+              <w:rPr>
+                <w:sz w:val="15"/>
+                <w:szCs w:val="15"/>
+                <w:rFonts w:ascii="Calibri" w:cs="Calibri" w:eastAsia="Calibri" w:hAnsi="Calibri"/>
+              </w:rPr>
+              <w:t xml:space="preserve">Porto Murtinho</w:t>
+            </w:r>
+          </w:p>
+        </w:tc>
+        <w:tc>
+          <w:tcPr>
+            <w:tcW w:type="dxa" w:w="1171"/>
+            <w:tcMar>
+              <w:top w:type="dxa" w:w="30"/>
+              <w:left w:type="dxa" w:w="70"/>
+              <w:bottom w:type="dxa" w:w="30"/>
+              <w:right w:type="dxa" w:w="70"/>
+            </w:tcMar>
+          </w:tcPr>
+          <w:p>
+            <w:pPr>
+              <w:jc w:val="right"/>
+            </w:pPr>
+            <w:r>
+              <w:rPr>
+                <w:sz w:val="15"/>
+                <w:szCs w:val="15"/>
+                <w:rFonts w:ascii="Calibri" w:cs="Calibri" w:eastAsia="Calibri" w:hAnsi="Calibri"/>
+              </w:rPr>
+              <w:t xml:space="preserve">26</w:t>
+            </w:r>
+          </w:p>
+        </w:tc>
+      </w:tr>
+      <w:tr>
+        <w:trPr>
+          <w:cantSplit/>
+        </w:trPr>
+        <w:tc>
+          <w:tcPr>
+            <w:tcW w:type="dxa" w:w="3707"/>
+            <w:tcMar>
+              <w:top w:type="dxa" w:w="30"/>
+              <w:left w:type="dxa" w:w="70"/>
+              <w:bottom w:type="dxa" w:w="30"/>
+              <w:right w:type="dxa" w:w="70"/>
+            </w:tcMar>
+          </w:tcPr>
+          <w:p>
+            <w:pPr>
+              <w:jc w:val="left"/>
+            </w:pPr>
+            <w:r>
+              <w:rPr>
+                <w:sz w:val="15"/>
+                <w:szCs w:val="15"/>
+                <w:rFonts w:ascii="Calibri" w:cs="Calibri" w:eastAsia="Calibri" w:hAnsi="Calibri"/>
+              </w:rPr>
+              <w:t xml:space="preserve">Corguinho</w:t>
+            </w:r>
+          </w:p>
+        </w:tc>
+        <w:tc>
+          <w:tcPr>
+            <w:tcW w:type="dxa" w:w="1171"/>
+            <w:tcMar>
+              <w:top w:type="dxa" w:w="30"/>
+              <w:left w:type="dxa" w:w="70"/>
+              <w:bottom w:type="dxa" w:w="30"/>
+              <w:right w:type="dxa" w:w="70"/>
+            </w:tcMar>
+          </w:tcPr>
+          <w:p>
+            <w:pPr>
+              <w:jc w:val="right"/>
+            </w:pPr>
+            <w:r>
+              <w:rPr>
+                <w:sz w:val="15"/>
+                <w:szCs w:val="15"/>
+                <w:rFonts w:ascii="Calibri" w:cs="Calibri" w:eastAsia="Calibri" w:hAnsi="Calibri"/>
+              </w:rPr>
+              <w:t xml:space="preserve">18</w:t>
+            </w:r>
+          </w:p>
+        </w:tc>
+        <w:tc>
+          <w:tcPr>
+            <w:tcW w:type="dxa" w:w="3707"/>
+            <w:tcMar>
+              <w:top w:type="dxa" w:w="30"/>
+              <w:left w:type="dxa" w:w="70"/>
+              <w:bottom w:type="dxa" w:w="30"/>
+              <w:right w:type="dxa" w:w="70"/>
+            </w:tcMar>
+          </w:tcPr>
+          <w:p>
+            <w:pPr>
+              <w:jc w:val="left"/>
+            </w:pPr>
+            <w:r>
+              <w:rPr>
+                <w:sz w:val="15"/>
+                <w:szCs w:val="15"/>
+                <w:rFonts w:ascii="Calibri" w:cs="Calibri" w:eastAsia="Calibri" w:hAnsi="Calibri"/>
+              </w:rPr>
+              <w:t xml:space="preserve">Ribas do Rio Pardo</w:t>
+            </w:r>
+          </w:p>
+        </w:tc>
+        <w:tc>
+          <w:tcPr>
+            <w:tcW w:type="dxa" w:w="1171"/>
+            <w:tcMar>
+              <w:top w:type="dxa" w:w="30"/>
+              <w:left w:type="dxa" w:w="70"/>
+              <w:bottom w:type="dxa" w:w="30"/>
+              <w:right w:type="dxa" w:w="70"/>
+            </w:tcMar>
+          </w:tcPr>
+          <w:p>
+            <w:pPr>
+              <w:jc w:val="right"/>
+            </w:pPr>
+            <w:r>
+              <w:rPr>
+                <w:sz w:val="15"/>
+                <w:szCs w:val="15"/>
+                <w:rFonts w:ascii="Calibri" w:cs="Calibri" w:eastAsia="Calibri" w:hAnsi="Calibri"/>
+              </w:rPr>
+              <w:t xml:space="preserve">28</w:t>
+            </w:r>
+          </w:p>
+        </w:tc>
+      </w:tr>
+      <w:tr>
+        <w:trPr>
+          <w:cantSplit/>
+        </w:trPr>
+        <w:tc>
+          <w:tcPr>
+            <w:tcW w:type="dxa" w:w="3707"/>
+            <w:tcMar>
+              <w:top w:type="dxa" w:w="30"/>
+              <w:left w:type="dxa" w:w="70"/>
+              <w:bottom w:type="dxa" w:w="30"/>
+              <w:right w:type="dxa" w:w="70"/>
+            </w:tcMar>
+          </w:tcPr>
+          <w:p>
+            <w:pPr>
+              <w:jc w:val="left"/>
+            </w:pPr>
+            <w:r>
+              <w:rPr>
+                <w:sz w:val="15"/>
+                <w:szCs w:val="15"/>
+                <w:rFonts w:ascii="Calibri" w:cs="Calibri" w:eastAsia="Calibri" w:hAnsi="Calibri"/>
+              </w:rPr>
+              <w:t xml:space="preserve">Coronel Sapucaia</w:t>
+            </w:r>
+          </w:p>
+        </w:tc>
+        <w:tc>
+          <w:tcPr>
+            <w:tcW w:type="dxa" w:w="1171"/>
+            <w:tcMar>
+              <w:top w:type="dxa" w:w="30"/>
+              <w:left w:type="dxa" w:w="70"/>
+              <w:bottom w:type="dxa" w:w="30"/>
+              <w:right w:type="dxa" w:w="70"/>
+            </w:tcMar>
+          </w:tcPr>
+          <w:p>
+            <w:pPr>
+              <w:jc w:val="right"/>
+            </w:pPr>
+            <w:r>
+              <w:rPr>
+                <w:sz w:val="15"/>
+                <w:szCs w:val="15"/>
+                <w:rFonts w:ascii="Calibri" w:cs="Calibri" w:eastAsia="Calibri" w:hAnsi="Calibri"/>
+              </w:rPr>
+              <w:t xml:space="preserve">24</w:t>
+            </w:r>
+          </w:p>
+        </w:tc>
+        <w:tc>
+          <w:tcPr>
+            <w:tcW w:type="dxa" w:w="3707"/>
+            <w:tcMar>
+              <w:top w:type="dxa" w:w="30"/>
+              <w:left w:type="dxa" w:w="70"/>
+              <w:bottom w:type="dxa" w:w="30"/>
+              <w:right w:type="dxa" w:w="70"/>
+            </w:tcMar>
+          </w:tcPr>
+          <w:p>
+            <w:pPr>
+              <w:jc w:val="left"/>
+            </w:pPr>
+            <w:r>
+              <w:rPr>
+                <w:sz w:val="15"/>
+                <w:szCs w:val="15"/>
+                <w:rFonts w:ascii="Calibri" w:cs="Calibri" w:eastAsia="Calibri" w:hAnsi="Calibri"/>
+              </w:rPr>
+              <w:t xml:space="preserve">Rio Brilhante</w:t>
+            </w:r>
+          </w:p>
+        </w:tc>
+        <w:tc>
+          <w:tcPr>
+            <w:tcW w:type="dxa" w:w="1171"/>
+            <w:tcMar>
+              <w:top w:type="dxa" w:w="30"/>
+              <w:left w:type="dxa" w:w="70"/>
+              <w:bottom w:type="dxa" w:w="30"/>
+              <w:right w:type="dxa" w:w="70"/>
+            </w:tcMar>
+          </w:tcPr>
+          <w:p>
+            <w:pPr>
+              <w:jc w:val="right"/>
+            </w:pPr>
+            <w:r>
+              <w:rPr>
+                <w:sz w:val="15"/>
+                <w:szCs w:val="15"/>
+                <w:rFonts w:ascii="Calibri" w:cs="Calibri" w:eastAsia="Calibri" w:hAnsi="Calibri"/>
+              </w:rPr>
+              <w:t xml:space="preserve">26</w:t>
+            </w:r>
+          </w:p>
+        </w:tc>
+      </w:tr>
+      <w:tr>
+        <w:trPr>
+          <w:cantSplit/>
+        </w:trPr>
+        <w:tc>
+          <w:tcPr>
+            <w:tcW w:type="dxa" w:w="3707"/>
+            <w:tcMar>
+              <w:top w:type="dxa" w:w="30"/>
+              <w:left w:type="dxa" w:w="70"/>
+              <w:bottom w:type="dxa" w:w="30"/>
+              <w:right w:type="dxa" w:w="70"/>
+            </w:tcMar>
+          </w:tcPr>
+          <w:p>
+            <w:pPr>
+              <w:jc w:val="left"/>
+            </w:pPr>
+            <w:r>
+              <w:rPr>
+                <w:sz w:val="15"/>
+                <w:szCs w:val="15"/>
+                <w:rFonts w:ascii="Calibri" w:cs="Calibri" w:eastAsia="Calibri" w:hAnsi="Calibri"/>
+              </w:rPr>
+              <w:t xml:space="preserve">Corumbá</w:t>
+            </w:r>
+          </w:p>
+        </w:tc>
+        <w:tc>
+          <w:tcPr>
+            <w:tcW w:type="dxa" w:w="1171"/>
+            <w:tcMar>
+              <w:top w:type="dxa" w:w="30"/>
+              <w:left w:type="dxa" w:w="70"/>
+              <w:bottom w:type="dxa" w:w="30"/>
+              <w:right w:type="dxa" w:w="70"/>
+            </w:tcMar>
+          </w:tcPr>
+          <w:p>
+            <w:pPr>
+              <w:jc w:val="right"/>
+            </w:pPr>
+            <w:r>
+              <w:rPr>
+                <w:sz w:val="15"/>
+                <w:szCs w:val="15"/>
+                <w:rFonts w:ascii="Calibri" w:cs="Calibri" w:eastAsia="Calibri" w:hAnsi="Calibri"/>
+              </w:rPr>
+              <w:t xml:space="preserve">26</w:t>
+            </w:r>
+          </w:p>
+        </w:tc>
+        <w:tc>
+          <w:tcPr>
+            <w:tcW w:type="dxa" w:w="3707"/>
+            <w:tcMar>
+              <w:top w:type="dxa" w:w="30"/>
+              <w:left w:type="dxa" w:w="70"/>
+              <w:bottom w:type="dxa" w:w="30"/>
+              <w:right w:type="dxa" w:w="70"/>
+            </w:tcMar>
+          </w:tcPr>
+          <w:p>
+            <w:pPr>
+              <w:jc w:val="left"/>
+            </w:pPr>
+            <w:r>
+              <w:rPr>
+                <w:sz w:val="15"/>
+                <w:szCs w:val="15"/>
+                <w:rFonts w:ascii="Calibri" w:cs="Calibri" w:eastAsia="Calibri" w:hAnsi="Calibri"/>
+              </w:rPr>
+              <w:t xml:space="preserve">Rio Negro</w:t>
+            </w:r>
+          </w:p>
+        </w:tc>
+        <w:tc>
+          <w:tcPr>
+            <w:tcW w:type="dxa" w:w="1171"/>
+            <w:tcMar>
+              <w:top w:type="dxa" w:w="30"/>
+              <w:left w:type="dxa" w:w="70"/>
+              <w:bottom w:type="dxa" w:w="30"/>
+              <w:right w:type="dxa" w:w="70"/>
+            </w:tcMar>
+          </w:tcPr>
+          <w:p>
+            <w:pPr>
+              <w:jc w:val="right"/>
+            </w:pPr>
+            <w:r>
+              <w:rPr>
+                <w:sz w:val="15"/>
+                <w:szCs w:val="15"/>
+                <w:rFonts w:ascii="Calibri" w:cs="Calibri" w:eastAsia="Calibri" w:hAnsi="Calibri"/>
+              </w:rPr>
+              <w:t xml:space="preserve">20</w:t>
+            </w:r>
+          </w:p>
+        </w:tc>
+      </w:tr>
+      <w:tr>
+        <w:trPr>
+          <w:cantSplit/>
+        </w:trPr>
+        <w:tc>
+          <w:tcPr>
+            <w:tcW w:type="dxa" w:w="3707"/>
+            <w:tcMar>
+              <w:top w:type="dxa" w:w="30"/>
+              <w:left w:type="dxa" w:w="70"/>
+              <w:bottom w:type="dxa" w:w="30"/>
+              <w:right w:type="dxa" w:w="70"/>
+            </w:tcMar>
+          </w:tcPr>
+          <w:p>
+            <w:pPr>
+              <w:jc w:val="left"/>
+            </w:pPr>
+            <w:r>
+              <w:rPr>
+                <w:sz w:val="15"/>
+                <w:szCs w:val="15"/>
+                <w:rFonts w:ascii="Calibri" w:cs="Calibri" w:eastAsia="Calibri" w:hAnsi="Calibri"/>
+              </w:rPr>
+              <w:t xml:space="preserve">Costa Rica</w:t>
+            </w:r>
+          </w:p>
+        </w:tc>
+        <w:tc>
+          <w:tcPr>
+            <w:tcW w:type="dxa" w:w="1171"/>
+            <w:tcMar>
+              <w:top w:type="dxa" w:w="30"/>
+              <w:left w:type="dxa" w:w="70"/>
+              <w:bottom w:type="dxa" w:w="30"/>
+              <w:right w:type="dxa" w:w="70"/>
+            </w:tcMar>
+          </w:tcPr>
+          <w:p>
+            <w:pPr>
+              <w:jc w:val="right"/>
+            </w:pPr>
+            <w:r>
+              <w:rPr>
+                <w:sz w:val="15"/>
+                <w:szCs w:val="15"/>
+                <w:rFonts w:ascii="Calibri" w:cs="Calibri" w:eastAsia="Calibri" w:hAnsi="Calibri"/>
+              </w:rPr>
+              <w:t xml:space="preserve">24</w:t>
+            </w:r>
+          </w:p>
+        </w:tc>
+        <w:tc>
+          <w:tcPr>
+            <w:tcW w:type="dxa" w:w="3707"/>
+            <w:tcMar>
+              <w:top w:type="dxa" w:w="30"/>
+              <w:left w:type="dxa" w:w="70"/>
+              <w:bottom w:type="dxa" w:w="30"/>
+              <w:right w:type="dxa" w:w="70"/>
+            </w:tcMar>
+          </w:tcPr>
+          <w:p>
+            <w:pPr>
+              <w:jc w:val="left"/>
+            </w:pPr>
+            <w:r>
+              <w:rPr>
+                <w:sz w:val="15"/>
+                <w:szCs w:val="15"/>
+                <w:rFonts w:ascii="Calibri" w:cs="Calibri" w:eastAsia="Calibri" w:hAnsi="Calibri"/>
+              </w:rPr>
+              <w:t xml:space="preserve">Rio Verde de Mato Grosso</w:t>
+            </w:r>
+          </w:p>
+        </w:tc>
+        <w:tc>
+          <w:tcPr>
+            <w:tcW w:type="dxa" w:w="1171"/>
+            <w:tcMar>
+              <w:top w:type="dxa" w:w="30"/>
+              <w:left w:type="dxa" w:w="70"/>
+              <w:bottom w:type="dxa" w:w="30"/>
+              <w:right w:type="dxa" w:w="70"/>
+            </w:tcMar>
+          </w:tcPr>
+          <w:p>
+            <w:pPr>
+              <w:jc w:val="right"/>
+            </w:pPr>
+            <w:r>
+              <w:rPr>
+                <w:sz w:val="15"/>
+                <w:szCs w:val="15"/>
+                <w:rFonts w:ascii="Calibri" w:cs="Calibri" w:eastAsia="Calibri" w:hAnsi="Calibri"/>
+              </w:rPr>
+              <w:t xml:space="preserve">24</w:t>
+            </w:r>
+          </w:p>
+        </w:tc>
+      </w:tr>
+      <w:tr>
+        <w:trPr>
+          <w:cantSplit/>
+        </w:trPr>
+        <w:tc>
+          <w:tcPr>
+            <w:tcW w:type="dxa" w:w="3707"/>
+            <w:tcMar>
+              <w:top w:type="dxa" w:w="30"/>
+              <w:left w:type="dxa" w:w="70"/>
+              <w:bottom w:type="dxa" w:w="30"/>
+              <w:right w:type="dxa" w:w="70"/>
+            </w:tcMar>
+          </w:tcPr>
+          <w:p>
+            <w:pPr>
+              <w:jc w:val="left"/>
+            </w:pPr>
+            <w:r>
+              <w:rPr>
+                <w:sz w:val="15"/>
+                <w:szCs w:val="15"/>
+                <w:rFonts w:ascii="Calibri" w:cs="Calibri" w:eastAsia="Calibri" w:hAnsi="Calibri"/>
+              </w:rPr>
+              <w:t xml:space="preserve">Coxim</w:t>
+            </w:r>
+          </w:p>
+        </w:tc>
+        <w:tc>
+          <w:tcPr>
+            <w:tcW w:type="dxa" w:w="1171"/>
+            <w:tcMar>
+              <w:top w:type="dxa" w:w="30"/>
+              <w:left w:type="dxa" w:w="70"/>
+              <w:bottom w:type="dxa" w:w="30"/>
+              <w:right w:type="dxa" w:w="70"/>
+            </w:tcMar>
+          </w:tcPr>
+          <w:p>
+            <w:pPr>
+              <w:jc w:val="right"/>
+            </w:pPr>
+            <w:r>
+              <w:rPr>
+                <w:sz w:val="15"/>
+                <w:szCs w:val="15"/>
+                <w:rFonts w:ascii="Calibri" w:cs="Calibri" w:eastAsia="Calibri" w:hAnsi="Calibri"/>
+              </w:rPr>
+              <w:t xml:space="preserve">22</w:t>
+            </w:r>
+          </w:p>
+        </w:tc>
+        <w:tc>
+          <w:tcPr>
+            <w:tcW w:type="dxa" w:w="3707"/>
+            <w:tcMar>
+              <w:top w:type="dxa" w:w="30"/>
+              <w:left w:type="dxa" w:w="70"/>
+              <w:bottom w:type="dxa" w:w="30"/>
+              <w:right w:type="dxa" w:w="70"/>
+            </w:tcMar>
+          </w:tcPr>
+          <w:p>
+            <w:pPr>
+              <w:jc w:val="left"/>
+            </w:pPr>
+            <w:r>
+              <w:rPr>
+                <w:sz w:val="15"/>
+                <w:szCs w:val="15"/>
+                <w:rFonts w:ascii="Calibri" w:cs="Calibri" w:eastAsia="Calibri" w:hAnsi="Calibri"/>
+              </w:rPr>
+              <w:t xml:space="preserve">Rochedo</w:t>
+            </w:r>
+          </w:p>
+        </w:tc>
+        <w:tc>
+          <w:tcPr>
+            <w:tcW w:type="dxa" w:w="1171"/>
+            <w:tcMar>
+              <w:top w:type="dxa" w:w="30"/>
+              <w:left w:type="dxa" w:w="70"/>
+              <w:bottom w:type="dxa" w:w="30"/>
+              <w:right w:type="dxa" w:w="70"/>
+            </w:tcMar>
+          </w:tcPr>
+          <w:p>
+            <w:pPr>
+              <w:jc w:val="right"/>
+            </w:pPr>
+            <w:r>
+              <w:rPr>
+                <w:sz w:val="15"/>
+                <w:szCs w:val="15"/>
+                <w:rFonts w:ascii="Calibri" w:cs="Calibri" w:eastAsia="Calibri" w:hAnsi="Calibri"/>
+              </w:rPr>
+              <w:t xml:space="preserve">20</w:t>
+            </w:r>
+          </w:p>
+        </w:tc>
+      </w:tr>
+      <w:tr>
+        <w:trPr>
+          <w:cantSplit/>
+        </w:trPr>
+        <w:tc>
+          <w:tcPr>
+            <w:tcW w:type="dxa" w:w="3707"/>
+            <w:tcMar>
+              <w:top w:type="dxa" w:w="30"/>
+              <w:left w:type="dxa" w:w="70"/>
+              <w:bottom w:type="dxa" w:w="30"/>
+              <w:right w:type="dxa" w:w="70"/>
+            </w:tcMar>
+          </w:tcPr>
+          <w:p>
+            <w:pPr>
+              <w:jc w:val="left"/>
+            </w:pPr>
+            <w:r>
+              <w:rPr>
+                <w:sz w:val="15"/>
+                <w:szCs w:val="15"/>
+                <w:rFonts w:ascii="Calibri" w:cs="Calibri" w:eastAsia="Calibri" w:hAnsi="Calibri"/>
+              </w:rPr>
+              <w:t xml:space="preserve">Deodápolis</w:t>
+            </w:r>
+          </w:p>
+        </w:tc>
+        <w:tc>
+          <w:tcPr>
+            <w:tcW w:type="dxa" w:w="1171"/>
+            <w:tcMar>
+              <w:top w:type="dxa" w:w="30"/>
+              <w:left w:type="dxa" w:w="70"/>
+              <w:bottom w:type="dxa" w:w="30"/>
+              <w:right w:type="dxa" w:w="70"/>
+            </w:tcMar>
+          </w:tcPr>
+          <w:p>
+            <w:pPr>
+              <w:jc w:val="right"/>
+            </w:pPr>
+            <w:r>
+              <w:rPr>
+                <w:sz w:val="15"/>
+                <w:szCs w:val="15"/>
+                <w:rFonts w:ascii="Calibri" w:cs="Calibri" w:eastAsia="Calibri" w:hAnsi="Calibri"/>
+              </w:rPr>
+              <w:t xml:space="preserve">22</w:t>
+            </w:r>
+          </w:p>
+        </w:tc>
+        <w:tc>
+          <w:tcPr>
+            <w:tcW w:type="dxa" w:w="3707"/>
+            <w:tcMar>
+              <w:top w:type="dxa" w:w="30"/>
+              <w:left w:type="dxa" w:w="70"/>
+              <w:bottom w:type="dxa" w:w="30"/>
+              <w:right w:type="dxa" w:w="70"/>
+            </w:tcMar>
+          </w:tcPr>
+          <w:p>
+            <w:pPr>
+              <w:jc w:val="left"/>
+            </w:pPr>
+            <w:r>
+              <w:rPr>
+                <w:sz w:val="15"/>
+                <w:szCs w:val="15"/>
+                <w:rFonts w:ascii="Calibri" w:cs="Calibri" w:eastAsia="Calibri" w:hAnsi="Calibri"/>
+              </w:rPr>
+              <w:t xml:space="preserve">Santa Rita do Pardo</w:t>
+            </w:r>
+          </w:p>
+        </w:tc>
+        <w:tc>
+          <w:tcPr>
+            <w:tcW w:type="dxa" w:w="1171"/>
+            <w:tcMar>
+              <w:top w:type="dxa" w:w="30"/>
+              <w:left w:type="dxa" w:w="70"/>
+              <w:bottom w:type="dxa" w:w="30"/>
+              <w:right w:type="dxa" w:w="70"/>
+            </w:tcMar>
+          </w:tcPr>
+          <w:p>
+            <w:pPr>
+              <w:jc w:val="right"/>
+            </w:pPr>
+            <w:r>
+              <w:rPr>
+                <w:sz w:val="15"/>
+                <w:szCs w:val="15"/>
+                <w:rFonts w:ascii="Calibri" w:cs="Calibri" w:eastAsia="Calibri" w:hAnsi="Calibri"/>
+              </w:rPr>
+              <w:t xml:space="preserve">28</w:t>
+            </w:r>
+          </w:p>
+        </w:tc>
+      </w:tr>
+      <w:tr>
+        <w:trPr>
+          <w:cantSplit/>
+        </w:trPr>
+        <w:tc>
+          <w:tcPr>
+            <w:tcW w:type="dxa" w:w="3707"/>
+            <w:tcMar>
+              <w:top w:type="dxa" w:w="30"/>
+              <w:left w:type="dxa" w:w="70"/>
+              <w:bottom w:type="dxa" w:w="30"/>
+              <w:right w:type="dxa" w:w="70"/>
+            </w:tcMar>
+          </w:tcPr>
+          <w:p>
+            <w:pPr>
+              <w:jc w:val="left"/>
+            </w:pPr>
+            <w:r>
+              <w:rPr>
+                <w:sz w:val="15"/>
+                <w:szCs w:val="15"/>
+                <w:rFonts w:ascii="Calibri" w:cs="Calibri" w:eastAsia="Calibri" w:hAnsi="Calibri"/>
+              </w:rPr>
+              <w:t xml:space="preserve">Dois Irmãos do Buriti</w:t>
+            </w:r>
+          </w:p>
+        </w:tc>
+        <w:tc>
+          <w:tcPr>
+            <w:tcW w:type="dxa" w:w="1171"/>
+            <w:tcMar>
+              <w:top w:type="dxa" w:w="30"/>
+              <w:left w:type="dxa" w:w="70"/>
+              <w:bottom w:type="dxa" w:w="30"/>
+              <w:right w:type="dxa" w:w="70"/>
+            </w:tcMar>
+          </w:tcPr>
+          <w:p>
+            <w:pPr>
+              <w:jc w:val="right"/>
+            </w:pPr>
+            <w:r>
+              <w:rPr>
+                <w:sz w:val="15"/>
+                <w:szCs w:val="15"/>
+                <w:rFonts w:ascii="Calibri" w:cs="Calibri" w:eastAsia="Calibri" w:hAnsi="Calibri"/>
+              </w:rPr>
+              <w:t xml:space="preserve">20</w:t>
+            </w:r>
+          </w:p>
+        </w:tc>
+        <w:tc>
+          <w:tcPr>
+            <w:tcW w:type="dxa" w:w="3707"/>
+            <w:tcMar>
+              <w:top w:type="dxa" w:w="30"/>
+              <w:left w:type="dxa" w:w="70"/>
+              <w:bottom w:type="dxa" w:w="30"/>
+              <w:right w:type="dxa" w:w="70"/>
+            </w:tcMar>
+          </w:tcPr>
+          <w:p>
+            <w:pPr>
+              <w:jc w:val="left"/>
+            </w:pPr>
+            <w:r>
+              <w:rPr>
+                <w:sz w:val="15"/>
+                <w:szCs w:val="15"/>
+                <w:rFonts w:ascii="Calibri" w:cs="Calibri" w:eastAsia="Calibri" w:hAnsi="Calibri"/>
+              </w:rPr>
+              <w:t xml:space="preserve">São Gabriel do Oeste</w:t>
+            </w:r>
+          </w:p>
+        </w:tc>
+        <w:tc>
+          <w:tcPr>
+            <w:tcW w:type="dxa" w:w="1171"/>
+            <w:tcMar>
+              <w:top w:type="dxa" w:w="30"/>
+              <w:left w:type="dxa" w:w="70"/>
+              <w:bottom w:type="dxa" w:w="30"/>
+              <w:right w:type="dxa" w:w="70"/>
+            </w:tcMar>
+          </w:tcPr>
+          <w:p>
+            <w:pPr>
+              <w:jc w:val="right"/>
+            </w:pPr>
+            <w:r>
+              <w:rPr>
+                <w:sz w:val="15"/>
+                <w:szCs w:val="15"/>
+                <w:rFonts w:ascii="Calibri" w:cs="Calibri" w:eastAsia="Calibri" w:hAnsi="Calibri"/>
+              </w:rPr>
+              <w:t xml:space="preserve">22</w:t>
+            </w:r>
+          </w:p>
+        </w:tc>
+      </w:tr>
+      <w:tr>
+        <w:trPr>
+          <w:cantSplit/>
+        </w:trPr>
+        <w:tc>
+          <w:tcPr>
+            <w:tcW w:type="dxa" w:w="3707"/>
+            <w:tcMar>
+              <w:top w:type="dxa" w:w="30"/>
+              <w:left w:type="dxa" w:w="70"/>
+              <w:bottom w:type="dxa" w:w="30"/>
+              <w:right w:type="dxa" w:w="70"/>
+            </w:tcMar>
+          </w:tcPr>
+          <w:p>
+            <w:pPr>
+              <w:jc w:val="left"/>
+            </w:pPr>
+            <w:r>
+              <w:rPr>
+                <w:sz w:val="15"/>
+                <w:szCs w:val="15"/>
+                <w:rFonts w:ascii="Calibri" w:cs="Calibri" w:eastAsia="Calibri" w:hAnsi="Calibri"/>
+              </w:rPr>
+              <w:t xml:space="preserve">Douradina</w:t>
+            </w:r>
+          </w:p>
+        </w:tc>
+        <w:tc>
+          <w:tcPr>
+            <w:tcW w:type="dxa" w:w="1171"/>
+            <w:tcMar>
+              <w:top w:type="dxa" w:w="30"/>
+              <w:left w:type="dxa" w:w="70"/>
+              <w:bottom w:type="dxa" w:w="30"/>
+              <w:right w:type="dxa" w:w="70"/>
+            </w:tcMar>
+          </w:tcPr>
+          <w:p>
+            <w:pPr>
+              <w:jc w:val="right"/>
+            </w:pPr>
+            <w:r>
+              <w:rPr>
+                <w:sz w:val="15"/>
+                <w:szCs w:val="15"/>
+                <w:rFonts w:ascii="Calibri" w:cs="Calibri" w:eastAsia="Calibri" w:hAnsi="Calibri"/>
+              </w:rPr>
+              <w:t xml:space="preserve">20</w:t>
+            </w:r>
+          </w:p>
+        </w:tc>
+        <w:tc>
+          <w:tcPr>
+            <w:tcW w:type="dxa" w:w="3707"/>
+            <w:tcMar>
+              <w:top w:type="dxa" w:w="30"/>
+              <w:left w:type="dxa" w:w="70"/>
+              <w:bottom w:type="dxa" w:w="30"/>
+              <w:right w:type="dxa" w:w="70"/>
+            </w:tcMar>
+          </w:tcPr>
+          <w:p>
+            <w:pPr>
+              <w:jc w:val="left"/>
+            </w:pPr>
+            <w:r>
+              <w:rPr>
+                <w:sz w:val="15"/>
+                <w:szCs w:val="15"/>
+                <w:rFonts w:ascii="Calibri" w:cs="Calibri" w:eastAsia="Calibri" w:hAnsi="Calibri"/>
+              </w:rPr>
+              <w:t xml:space="preserve">Selvíria</w:t>
+            </w:r>
+          </w:p>
+        </w:tc>
+        <w:tc>
+          <w:tcPr>
+            <w:tcW w:type="dxa" w:w="1171"/>
+            <w:tcMar>
+              <w:top w:type="dxa" w:w="30"/>
+              <w:left w:type="dxa" w:w="70"/>
+              <w:bottom w:type="dxa" w:w="30"/>
+              <w:right w:type="dxa" w:w="70"/>
+            </w:tcMar>
+          </w:tcPr>
+          <w:p>
+            <w:pPr>
+              <w:jc w:val="right"/>
+            </w:pPr>
+            <w:r>
+              <w:rPr>
+                <w:sz w:val="15"/>
+                <w:szCs w:val="15"/>
+                <w:rFonts w:ascii="Calibri" w:cs="Calibri" w:eastAsia="Calibri" w:hAnsi="Calibri"/>
+              </w:rPr>
+              <w:t xml:space="preserve">20</w:t>
+            </w:r>
+          </w:p>
+        </w:tc>
+      </w:tr>
+      <w:tr>
+        <w:trPr>
+          <w:cantSplit/>
+        </w:trPr>
+        <w:tc>
+          <w:tcPr>
+            <w:tcW w:type="dxa" w:w="3707"/>
+            <w:tcMar>
+              <w:top w:type="dxa" w:w="30"/>
+              <w:left w:type="dxa" w:w="70"/>
+              <w:bottom w:type="dxa" w:w="30"/>
+              <w:right w:type="dxa" w:w="70"/>
+            </w:tcMar>
+          </w:tcPr>
+          <w:p>
+            <w:pPr>
+              <w:jc w:val="left"/>
+            </w:pPr>
+            <w:r>
+              <w:rPr>
+                <w:sz w:val="15"/>
+                <w:szCs w:val="15"/>
+                <w:rFonts w:ascii="Calibri" w:cs="Calibri" w:eastAsia="Calibri" w:hAnsi="Calibri"/>
+              </w:rPr>
+              <w:t xml:space="preserve">Dourados</w:t>
+            </w:r>
+          </w:p>
+        </w:tc>
+        <w:tc>
+          <w:tcPr>
+            <w:tcW w:type="dxa" w:w="1171"/>
+            <w:tcMar>
+              <w:top w:type="dxa" w:w="30"/>
+              <w:left w:type="dxa" w:w="70"/>
+              <w:bottom w:type="dxa" w:w="30"/>
+              <w:right w:type="dxa" w:w="70"/>
+            </w:tcMar>
+          </w:tcPr>
+          <w:p>
+            <w:pPr>
+              <w:jc w:val="right"/>
+            </w:pPr>
+            <w:r>
+              <w:rPr>
+                <w:sz w:val="15"/>
+                <w:szCs w:val="15"/>
+                <w:rFonts w:ascii="Calibri" w:cs="Calibri" w:eastAsia="Calibri" w:hAnsi="Calibri"/>
+              </w:rPr>
+              <w:t xml:space="preserve">24</w:t>
+            </w:r>
+          </w:p>
+        </w:tc>
+        <w:tc>
+          <w:tcPr>
+            <w:tcW w:type="dxa" w:w="3707"/>
+            <w:tcMar>
+              <w:top w:type="dxa" w:w="30"/>
+              <w:left w:type="dxa" w:w="70"/>
+              <w:bottom w:type="dxa" w:w="30"/>
+              <w:right w:type="dxa" w:w="70"/>
+            </w:tcMar>
+          </w:tcPr>
+          <w:p>
+            <w:pPr>
+              <w:jc w:val="left"/>
+            </w:pPr>
+            <w:r>
+              <w:rPr>
+                <w:sz w:val="15"/>
+                <w:szCs w:val="15"/>
+                <w:rFonts w:ascii="Calibri" w:cs="Calibri" w:eastAsia="Calibri" w:hAnsi="Calibri"/>
+              </w:rPr>
+              <w:t xml:space="preserve">Sete Quedas</w:t>
+            </w:r>
+          </w:p>
+        </w:tc>
+        <w:tc>
+          <w:tcPr>
+            <w:tcW w:type="dxa" w:w="1171"/>
+            <w:tcMar>
+              <w:top w:type="dxa" w:w="30"/>
+              <w:left w:type="dxa" w:w="70"/>
+              <w:bottom w:type="dxa" w:w="30"/>
+              <w:right w:type="dxa" w:w="70"/>
+            </w:tcMar>
+          </w:tcPr>
+          <w:p>
+            <w:pPr>
+              <w:jc w:val="right"/>
+            </w:pPr>
+            <w:r>
+              <w:rPr>
+                <w:sz w:val="15"/>
+                <w:szCs w:val="15"/>
+                <w:rFonts w:ascii="Calibri" w:cs="Calibri" w:eastAsia="Calibri" w:hAnsi="Calibri"/>
+              </w:rPr>
+              <w:t xml:space="preserve">26</w:t>
+            </w:r>
+          </w:p>
+        </w:tc>
+      </w:tr>
+      <w:tr>
+        <w:trPr>
+          <w:cantSplit/>
+        </w:trPr>
+        <w:tc>
+          <w:tcPr>
+            <w:tcW w:type="dxa" w:w="3707"/>
+            <w:tcMar>
+              <w:top w:type="dxa" w:w="30"/>
+              <w:left w:type="dxa" w:w="70"/>
+              <w:bottom w:type="dxa" w:w="30"/>
+              <w:right w:type="dxa" w:w="70"/>
+            </w:tcMar>
+          </w:tcPr>
+          <w:p>
+            <w:pPr>
+              <w:jc w:val="left"/>
+            </w:pPr>
+            <w:r>
+              <w:rPr>
+                <w:sz w:val="15"/>
+                <w:szCs w:val="15"/>
+                <w:rFonts w:ascii="Calibri" w:cs="Calibri" w:eastAsia="Calibri" w:hAnsi="Calibri"/>
+              </w:rPr>
+              <w:t xml:space="preserve">Eldorado</w:t>
+            </w:r>
+          </w:p>
+        </w:tc>
+        <w:tc>
+          <w:tcPr>
+            <w:tcW w:type="dxa" w:w="1171"/>
+            <w:tcMar>
+              <w:top w:type="dxa" w:w="30"/>
+              <w:left w:type="dxa" w:w="70"/>
+              <w:bottom w:type="dxa" w:w="30"/>
+              <w:right w:type="dxa" w:w="70"/>
+            </w:tcMar>
+          </w:tcPr>
+          <w:p>
+            <w:pPr>
+              <w:jc w:val="right"/>
+            </w:pPr>
+            <w:r>
+              <w:rPr>
+                <w:sz w:val="15"/>
+                <w:szCs w:val="15"/>
+                <w:rFonts w:ascii="Calibri" w:cs="Calibri" w:eastAsia="Calibri" w:hAnsi="Calibri"/>
+              </w:rPr>
+              <w:t xml:space="preserve">22</w:t>
+            </w:r>
+          </w:p>
+        </w:tc>
+        <w:tc>
+          <w:tcPr>
+            <w:tcW w:type="dxa" w:w="3707"/>
+            <w:tcMar>
+              <w:top w:type="dxa" w:w="30"/>
+              <w:left w:type="dxa" w:w="70"/>
+              <w:bottom w:type="dxa" w:w="30"/>
+              <w:right w:type="dxa" w:w="70"/>
+            </w:tcMar>
+          </w:tcPr>
+          <w:p>
+            <w:pPr>
+              <w:jc w:val="left"/>
+            </w:pPr>
+            <w:r>
+              <w:rPr>
+                <w:sz w:val="15"/>
+                <w:szCs w:val="15"/>
+                <w:rFonts w:ascii="Calibri" w:cs="Calibri" w:eastAsia="Calibri" w:hAnsi="Calibri"/>
+              </w:rPr>
+              <w:t xml:space="preserve">Sidrolândia</w:t>
+            </w:r>
+          </w:p>
+        </w:tc>
+        <w:tc>
+          <w:tcPr>
+            <w:tcW w:type="dxa" w:w="1171"/>
+            <w:tcMar>
+              <w:top w:type="dxa" w:w="30"/>
+              <w:left w:type="dxa" w:w="70"/>
+              <w:bottom w:type="dxa" w:w="30"/>
+              <w:right w:type="dxa" w:w="70"/>
+            </w:tcMar>
+          </w:tcPr>
+          <w:p>
+            <w:pPr>
+              <w:jc w:val="right"/>
+            </w:pPr>
+            <w:r>
+              <w:rPr>
+                <w:sz w:val="15"/>
+                <w:szCs w:val="15"/>
+                <w:rFonts w:ascii="Calibri" w:cs="Calibri" w:eastAsia="Calibri" w:hAnsi="Calibri"/>
+              </w:rPr>
+              <w:t xml:space="preserve">24</w:t>
+            </w:r>
+          </w:p>
+        </w:tc>
+      </w:tr>
+      <w:tr>
+        <w:trPr>
+          <w:cantSplit/>
+        </w:trPr>
+        <w:tc>
+          <w:tcPr>
+            <w:tcW w:type="dxa" w:w="3707"/>
+            <w:tcMar>
+              <w:top w:type="dxa" w:w="30"/>
+              <w:left w:type="dxa" w:w="70"/>
+              <w:bottom w:type="dxa" w:w="30"/>
+              <w:right w:type="dxa" w:w="70"/>
+            </w:tcMar>
+          </w:tcPr>
+          <w:p>
+            <w:pPr>
+              <w:jc w:val="left"/>
+            </w:pPr>
+            <w:r>
+              <w:rPr>
+                <w:sz w:val="15"/>
+                <w:szCs w:val="15"/>
+                <w:rFonts w:ascii="Calibri" w:cs="Calibri" w:eastAsia="Calibri" w:hAnsi="Calibri"/>
+              </w:rPr>
+              <w:t xml:space="preserve">Fátima do Sul</w:t>
+            </w:r>
+          </w:p>
+        </w:tc>
+        <w:tc>
+          <w:tcPr>
+            <w:tcW w:type="dxa" w:w="1171"/>
+            <w:tcMar>
+              <w:top w:type="dxa" w:w="30"/>
+              <w:left w:type="dxa" w:w="70"/>
+              <w:bottom w:type="dxa" w:w="30"/>
+              <w:right w:type="dxa" w:w="70"/>
+            </w:tcMar>
+          </w:tcPr>
+          <w:p>
+            <w:pPr>
+              <w:jc w:val="right"/>
+            </w:pPr>
+            <w:r>
+              <w:rPr>
+                <w:sz w:val="15"/>
+                <w:szCs w:val="15"/>
+                <w:rFonts w:ascii="Calibri" w:cs="Calibri" w:eastAsia="Calibri" w:hAnsi="Calibri"/>
+              </w:rPr>
+              <w:t xml:space="preserve">24</w:t>
+            </w:r>
+          </w:p>
+        </w:tc>
+        <w:tc>
+          <w:tcPr>
+            <w:tcW w:type="dxa" w:w="3707"/>
+            <w:tcMar>
+              <w:top w:type="dxa" w:w="30"/>
+              <w:left w:type="dxa" w:w="70"/>
+              <w:bottom w:type="dxa" w:w="30"/>
+              <w:right w:type="dxa" w:w="70"/>
+            </w:tcMar>
+          </w:tcPr>
+          <w:p>
+            <w:pPr>
+              <w:jc w:val="left"/>
+            </w:pPr>
+            <w:r>
+              <w:rPr>
+                <w:sz w:val="15"/>
+                <w:szCs w:val="15"/>
+                <w:rFonts w:ascii="Calibri" w:cs="Calibri" w:eastAsia="Calibri" w:hAnsi="Calibri"/>
+              </w:rPr>
+              <w:t xml:space="preserve">Sonora</w:t>
+            </w:r>
+          </w:p>
+        </w:tc>
+        <w:tc>
+          <w:tcPr>
+            <w:tcW w:type="dxa" w:w="1171"/>
+            <w:tcMar>
+              <w:top w:type="dxa" w:w="30"/>
+              <w:left w:type="dxa" w:w="70"/>
+              <w:bottom w:type="dxa" w:w="30"/>
+              <w:right w:type="dxa" w:w="70"/>
+            </w:tcMar>
+          </w:tcPr>
+          <w:p>
+            <w:pPr>
+              <w:jc w:val="right"/>
+            </w:pPr>
+            <w:r>
+              <w:rPr>
+                <w:sz w:val="15"/>
+                <w:szCs w:val="15"/>
+                <w:rFonts w:ascii="Calibri" w:cs="Calibri" w:eastAsia="Calibri" w:hAnsi="Calibri"/>
+              </w:rPr>
+              <w:t xml:space="preserve">24</w:t>
+            </w:r>
+          </w:p>
+        </w:tc>
+      </w:tr>
+      <w:tr>
+        <w:trPr>
+          <w:cantSplit/>
+        </w:trPr>
+        <w:tc>
+          <w:tcPr>
+            <w:tcW w:type="dxa" w:w="3707"/>
+            <w:tcMar>
+              <w:top w:type="dxa" w:w="30"/>
+              <w:left w:type="dxa" w:w="70"/>
+              <w:bottom w:type="dxa" w:w="30"/>
+              <w:right w:type="dxa" w:w="70"/>
+            </w:tcMar>
+          </w:tcPr>
+          <w:p>
+            <w:pPr>
+              <w:jc w:val="left"/>
+            </w:pPr>
+            <w:r>
+              <w:rPr>
+                <w:sz w:val="15"/>
+                <w:szCs w:val="15"/>
+                <w:rFonts w:ascii="Calibri" w:cs="Calibri" w:eastAsia="Calibri" w:hAnsi="Calibri"/>
+              </w:rPr>
+              <w:t xml:space="preserve">Figueirão</w:t>
+            </w:r>
+          </w:p>
+        </w:tc>
+        <w:tc>
+          <w:tcPr>
+            <w:tcW w:type="dxa" w:w="1171"/>
+            <w:tcMar>
+              <w:top w:type="dxa" w:w="30"/>
+              <w:left w:type="dxa" w:w="70"/>
+              <w:bottom w:type="dxa" w:w="30"/>
+              <w:right w:type="dxa" w:w="70"/>
+            </w:tcMar>
+          </w:tcPr>
+          <w:p>
+            <w:pPr>
+              <w:jc w:val="right"/>
+            </w:pPr>
+            <w:r>
+              <w:rPr>
+                <w:sz w:val="15"/>
+                <w:szCs w:val="15"/>
+                <w:rFonts w:ascii="Calibri" w:cs="Calibri" w:eastAsia="Calibri" w:hAnsi="Calibri"/>
+              </w:rPr>
+              <w:t xml:space="preserve">24</w:t>
+            </w:r>
+          </w:p>
+        </w:tc>
+        <w:tc>
+          <w:tcPr>
+            <w:tcW w:type="dxa" w:w="3707"/>
+            <w:tcMar>
+              <w:top w:type="dxa" w:w="30"/>
+              <w:left w:type="dxa" w:w="70"/>
+              <w:bottom w:type="dxa" w:w="30"/>
+              <w:right w:type="dxa" w:w="70"/>
+            </w:tcMar>
+          </w:tcPr>
+          <w:p>
+            <w:pPr>
+              <w:jc w:val="left"/>
+            </w:pPr>
+            <w:r>
+              <w:rPr>
+                <w:sz w:val="15"/>
+                <w:szCs w:val="15"/>
+                <w:rFonts w:ascii="Calibri" w:cs="Calibri" w:eastAsia="Calibri" w:hAnsi="Calibri"/>
+              </w:rPr>
+              <w:t xml:space="preserve">Tacuru</w:t>
+            </w:r>
+          </w:p>
+        </w:tc>
+        <w:tc>
+          <w:tcPr>
+            <w:tcW w:type="dxa" w:w="1171"/>
+            <w:tcMar>
+              <w:top w:type="dxa" w:w="30"/>
+              <w:left w:type="dxa" w:w="70"/>
+              <w:bottom w:type="dxa" w:w="30"/>
+              <w:right w:type="dxa" w:w="70"/>
+            </w:tcMar>
+          </w:tcPr>
+          <w:p>
+            <w:pPr>
+              <w:jc w:val="right"/>
+            </w:pPr>
+            <w:r>
+              <w:rPr>
+                <w:sz w:val="15"/>
+                <w:szCs w:val="15"/>
+                <w:rFonts w:ascii="Calibri" w:cs="Calibri" w:eastAsia="Calibri" w:hAnsi="Calibri"/>
+              </w:rPr>
+              <w:t xml:space="preserve">24</w:t>
+            </w:r>
+          </w:p>
+        </w:tc>
+      </w:tr>
+      <w:tr>
+        <w:trPr>
+          <w:cantSplit/>
+        </w:trPr>
+        <w:tc>
+          <w:tcPr>
+            <w:tcW w:type="dxa" w:w="3707"/>
+            <w:tcMar>
+              <w:top w:type="dxa" w:w="30"/>
+              <w:left w:type="dxa" w:w="70"/>
+              <w:bottom w:type="dxa" w:w="30"/>
+              <w:right w:type="dxa" w:w="70"/>
+            </w:tcMar>
+          </w:tcPr>
+          <w:p>
+            <w:pPr>
+              <w:jc w:val="left"/>
+            </w:pPr>
+            <w:r>
+              <w:rPr>
+                <w:sz w:val="15"/>
+                <w:szCs w:val="15"/>
+                <w:rFonts w:ascii="Calibri" w:cs="Calibri" w:eastAsia="Calibri" w:hAnsi="Calibri"/>
+              </w:rPr>
+              <w:t xml:space="preserve">Glória de Dourados</w:t>
+            </w:r>
+          </w:p>
+        </w:tc>
+        <w:tc>
+          <w:tcPr>
+            <w:tcW w:type="dxa" w:w="1171"/>
+            <w:tcMar>
+              <w:top w:type="dxa" w:w="30"/>
+              <w:left w:type="dxa" w:w="70"/>
+              <w:bottom w:type="dxa" w:w="30"/>
+              <w:right w:type="dxa" w:w="70"/>
+            </w:tcMar>
+          </w:tcPr>
+          <w:p>
+            <w:pPr>
+              <w:jc w:val="right"/>
+            </w:pPr>
+            <w:r>
+              <w:rPr>
+                <w:sz w:val="15"/>
+                <w:szCs w:val="15"/>
+                <w:rFonts w:ascii="Calibri" w:cs="Calibri" w:eastAsia="Calibri" w:hAnsi="Calibri"/>
+              </w:rPr>
+              <w:t xml:space="preserve">22</w:t>
+            </w:r>
+          </w:p>
+        </w:tc>
+        <w:tc>
+          <w:tcPr>
+            <w:tcW w:type="dxa" w:w="3707"/>
+            <w:tcMar>
+              <w:top w:type="dxa" w:w="30"/>
+              <w:left w:type="dxa" w:w="70"/>
+              <w:bottom w:type="dxa" w:w="30"/>
+              <w:right w:type="dxa" w:w="70"/>
+            </w:tcMar>
+          </w:tcPr>
+          <w:p>
+            <w:pPr>
+              <w:jc w:val="left"/>
+            </w:pPr>
+            <w:r>
+              <w:rPr>
+                <w:sz w:val="15"/>
+                <w:szCs w:val="15"/>
+                <w:rFonts w:ascii="Calibri" w:cs="Calibri" w:eastAsia="Calibri" w:hAnsi="Calibri"/>
+              </w:rPr>
+              <w:t xml:space="preserve">Taquarussu</w:t>
+            </w:r>
+          </w:p>
+        </w:tc>
+        <w:tc>
+          <w:tcPr>
+            <w:tcW w:type="dxa" w:w="1171"/>
+            <w:tcMar>
+              <w:top w:type="dxa" w:w="30"/>
+              <w:left w:type="dxa" w:w="70"/>
+              <w:bottom w:type="dxa" w:w="30"/>
+              <w:right w:type="dxa" w:w="70"/>
+            </w:tcMar>
+          </w:tcPr>
+          <w:p>
+            <w:pPr>
+              <w:jc w:val="right"/>
+            </w:pPr>
+            <w:r>
+              <w:rPr>
+                <w:sz w:val="15"/>
+                <w:szCs w:val="15"/>
+                <w:rFonts w:ascii="Calibri" w:cs="Calibri" w:eastAsia="Calibri" w:hAnsi="Calibri"/>
+              </w:rPr>
+              <w:t xml:space="preserve">22</w:t>
+            </w:r>
+          </w:p>
+        </w:tc>
+      </w:tr>
+      <w:tr>
+        <w:trPr>
+          <w:cantSplit/>
+        </w:trPr>
+        <w:tc>
+          <w:tcPr>
+            <w:tcW w:type="dxa" w:w="3707"/>
+            <w:tcMar>
+              <w:top w:type="dxa" w:w="30"/>
+              <w:left w:type="dxa" w:w="70"/>
+              <w:bottom w:type="dxa" w:w="30"/>
+              <w:right w:type="dxa" w:w="70"/>
+            </w:tcMar>
+          </w:tcPr>
+          <w:p>
+            <w:pPr>
+              <w:jc w:val="left"/>
+            </w:pPr>
+            <w:r>
+              <w:rPr>
+                <w:sz w:val="15"/>
+                <w:szCs w:val="15"/>
+                <w:rFonts w:ascii="Calibri" w:cs="Calibri" w:eastAsia="Calibri" w:hAnsi="Calibri"/>
+              </w:rPr>
+              <w:t xml:space="preserve">Guia Lopes da Laguna</w:t>
+            </w:r>
+          </w:p>
+        </w:tc>
+        <w:tc>
+          <w:tcPr>
+            <w:tcW w:type="dxa" w:w="1171"/>
+            <w:tcMar>
+              <w:top w:type="dxa" w:w="30"/>
+              <w:left w:type="dxa" w:w="70"/>
+              <w:bottom w:type="dxa" w:w="30"/>
+              <w:right w:type="dxa" w:w="70"/>
+            </w:tcMar>
+          </w:tcPr>
+          <w:p>
+            <w:pPr>
+              <w:jc w:val="right"/>
+            </w:pPr>
+            <w:r>
+              <w:rPr>
+                <w:sz w:val="15"/>
+                <w:szCs w:val="15"/>
+                <w:rFonts w:ascii="Calibri" w:cs="Calibri" w:eastAsia="Calibri" w:hAnsi="Calibri"/>
+              </w:rPr>
+              <w:t xml:space="preserve">22</w:t>
+            </w:r>
+          </w:p>
+        </w:tc>
+        <w:tc>
+          <w:tcPr>
+            <w:tcW w:type="dxa" w:w="3707"/>
+            <w:tcMar>
+              <w:top w:type="dxa" w:w="30"/>
+              <w:left w:type="dxa" w:w="70"/>
+              <w:bottom w:type="dxa" w:w="30"/>
+              <w:right w:type="dxa" w:w="70"/>
+            </w:tcMar>
+          </w:tcPr>
+          <w:p>
+            <w:pPr>
+              <w:jc w:val="left"/>
+            </w:pPr>
+            <w:r>
+              <w:rPr>
+                <w:sz w:val="15"/>
+                <w:szCs w:val="15"/>
+                <w:rFonts w:ascii="Calibri" w:cs="Calibri" w:eastAsia="Calibri" w:hAnsi="Calibri"/>
+              </w:rPr>
+              <w:t xml:space="preserve">Terenos</w:t>
+            </w:r>
+          </w:p>
+        </w:tc>
+        <w:tc>
+          <w:tcPr>
+            <w:tcW w:type="dxa" w:w="1171"/>
+            <w:tcMar>
+              <w:top w:type="dxa" w:w="30"/>
+              <w:left w:type="dxa" w:w="70"/>
+              <w:bottom w:type="dxa" w:w="30"/>
+              <w:right w:type="dxa" w:w="70"/>
+            </w:tcMar>
+          </w:tcPr>
+          <w:p>
+            <w:pPr>
+              <w:jc w:val="right"/>
+            </w:pPr>
+            <w:r>
+              <w:rPr>
+                <w:sz w:val="15"/>
+                <w:szCs w:val="15"/>
+                <w:rFonts w:ascii="Calibri" w:cs="Calibri" w:eastAsia="Calibri" w:hAnsi="Calibri"/>
+              </w:rPr>
+              <w:t xml:space="preserve">20</w:t>
+            </w:r>
+          </w:p>
+        </w:tc>
+      </w:tr>
+      <w:tr>
+        <w:trPr>
+          <w:cantSplit/>
+        </w:trPr>
+        <w:tc>
+          <w:tcPr>
+            <w:tcW w:type="dxa" w:w="3707"/>
+            <w:tcMar>
+              <w:top w:type="dxa" w:w="30"/>
+              <w:left w:type="dxa" w:w="70"/>
+              <w:bottom w:type="dxa" w:w="30"/>
+              <w:right w:type="dxa" w:w="70"/>
+            </w:tcMar>
+          </w:tcPr>
+          <w:p>
+            <w:pPr>
+              <w:jc w:val="left"/>
+            </w:pPr>
+            <w:r>
+              <w:rPr>
+                <w:sz w:val="15"/>
+                <w:szCs w:val="15"/>
+                <w:rFonts w:ascii="Calibri" w:cs="Calibri" w:eastAsia="Calibri" w:hAnsi="Calibri"/>
+              </w:rPr>
+              <w:t xml:space="preserve">Iguatemi</w:t>
+            </w:r>
+          </w:p>
+        </w:tc>
+        <w:tc>
+          <w:tcPr>
+            <w:tcW w:type="dxa" w:w="1171"/>
+            <w:tcMar>
+              <w:top w:type="dxa" w:w="30"/>
+              <w:left w:type="dxa" w:w="70"/>
+              <w:bottom w:type="dxa" w:w="30"/>
+              <w:right w:type="dxa" w:w="70"/>
+            </w:tcMar>
+          </w:tcPr>
+          <w:p>
+            <w:pPr>
+              <w:jc w:val="right"/>
+            </w:pPr>
+            <w:r>
+              <w:rPr>
+                <w:sz w:val="15"/>
+                <w:szCs w:val="15"/>
+                <w:rFonts w:ascii="Calibri" w:cs="Calibri" w:eastAsia="Calibri" w:hAnsi="Calibri"/>
+              </w:rPr>
+              <w:t xml:space="preserve">24</w:t>
+            </w:r>
+          </w:p>
+        </w:tc>
+        <w:tc>
+          <w:tcPr>
+            <w:tcW w:type="dxa" w:w="3707"/>
+            <w:tcMar>
+              <w:top w:type="dxa" w:w="30"/>
+              <w:left w:type="dxa" w:w="70"/>
+              <w:bottom w:type="dxa" w:w="30"/>
+              <w:right w:type="dxa" w:w="70"/>
+            </w:tcMar>
+          </w:tcPr>
+          <w:p>
+            <w:pPr>
+              <w:jc w:val="left"/>
+            </w:pPr>
+            <w:r>
+              <w:rPr>
+                <w:sz w:val="15"/>
+                <w:szCs w:val="15"/>
+                <w:rFonts w:ascii="Calibri" w:cs="Calibri" w:eastAsia="Calibri" w:hAnsi="Calibri"/>
+              </w:rPr>
+              <w:t xml:space="preserve">Três Lagoas</w:t>
+            </w:r>
+          </w:p>
+        </w:tc>
+        <w:tc>
+          <w:tcPr>
+            <w:tcW w:type="dxa" w:w="1171"/>
+            <w:tcMar>
+              <w:top w:type="dxa" w:w="30"/>
+              <w:left w:type="dxa" w:w="70"/>
+              <w:bottom w:type="dxa" w:w="30"/>
+              <w:right w:type="dxa" w:w="70"/>
+            </w:tcMar>
+          </w:tcPr>
+          <w:p>
+            <w:pPr>
+              <w:jc w:val="right"/>
+            </w:pPr>
+            <w:r>
+              <w:rPr>
+                <w:sz w:val="15"/>
+                <w:szCs w:val="15"/>
+                <w:rFonts w:ascii="Calibri" w:cs="Calibri" w:eastAsia="Calibri" w:hAnsi="Calibri"/>
+              </w:rPr>
+              <w:t xml:space="preserve">22</w:t>
+            </w:r>
+          </w:p>
+        </w:tc>
+      </w:tr>
+      <w:tr>
+        <w:trPr>
+          <w:cantSplit/>
+        </w:trPr>
+        <w:tc>
+          <w:tcPr>
+            <w:tcW w:type="dxa" w:w="3707"/>
+            <w:tcMar>
+              <w:top w:type="dxa" w:w="30"/>
+              <w:left w:type="dxa" w:w="70"/>
+              <w:bottom w:type="dxa" w:w="30"/>
+              <w:right w:type="dxa" w:w="70"/>
+            </w:tcMar>
+          </w:tcPr>
+          <w:p>
+            <w:pPr>
+              <w:jc w:val="left"/>
+            </w:pPr>
+            <w:r>
+              <w:rPr>
+                <w:sz w:val="15"/>
+                <w:szCs w:val="15"/>
+                <w:rFonts w:ascii="Calibri" w:cs="Calibri" w:eastAsia="Calibri" w:hAnsi="Calibri"/>
+              </w:rPr>
+              <w:t xml:space="preserve">Inocência</w:t>
+            </w:r>
+          </w:p>
+        </w:tc>
+        <w:tc>
+          <w:tcPr>
+            <w:tcW w:type="dxa" w:w="1171"/>
+            <w:tcMar>
+              <w:top w:type="dxa" w:w="30"/>
+              <w:left w:type="dxa" w:w="70"/>
+              <w:bottom w:type="dxa" w:w="30"/>
+              <w:right w:type="dxa" w:w="70"/>
+            </w:tcMar>
+          </w:tcPr>
+          <w:p>
+            <w:pPr>
+              <w:jc w:val="right"/>
+            </w:pPr>
+            <w:r>
+              <w:rPr>
+                <w:sz w:val="15"/>
+                <w:szCs w:val="15"/>
+                <w:rFonts w:ascii="Calibri" w:cs="Calibri" w:eastAsia="Calibri" w:hAnsi="Calibri"/>
+              </w:rPr>
+              <w:t xml:space="preserve">20</w:t>
+            </w:r>
+          </w:p>
+        </w:tc>
+        <w:tc>
+          <w:tcPr>
+            <w:tcW w:type="dxa" w:w="3707"/>
+            <w:tcMar>
+              <w:top w:type="dxa" w:w="30"/>
+              <w:left w:type="dxa" w:w="70"/>
+              <w:bottom w:type="dxa" w:w="30"/>
+              <w:right w:type="dxa" w:w="70"/>
+            </w:tcMar>
+          </w:tcPr>
+          <w:p>
+            <w:pPr>
+              <w:jc w:val="left"/>
+            </w:pPr>
+            <w:r>
+              <w:rPr>
+                <w:sz w:val="15"/>
+                <w:szCs w:val="15"/>
+                <w:rFonts w:ascii="Calibri" w:cs="Calibri" w:eastAsia="Calibri" w:hAnsi="Calibri"/>
+              </w:rPr>
+              <w:t xml:space="preserve">Vicentina</w:t>
+            </w:r>
+          </w:p>
+        </w:tc>
+        <w:tc>
+          <w:tcPr>
+            <w:tcW w:type="dxa" w:w="1171"/>
+            <w:tcMar>
+              <w:top w:type="dxa" w:w="30"/>
+              <w:left w:type="dxa" w:w="70"/>
+              <w:bottom w:type="dxa" w:w="30"/>
+              <w:right w:type="dxa" w:w="70"/>
+            </w:tcMar>
+          </w:tcPr>
+          <w:p>
+            <w:pPr>
+              <w:jc w:val="right"/>
+            </w:pPr>
+            <w:r>
+              <w:rPr>
+                <w:sz w:val="15"/>
+                <w:szCs w:val="15"/>
+                <w:rFonts w:ascii="Calibri" w:cs="Calibri" w:eastAsia="Calibri" w:hAnsi="Calibri"/>
+              </w:rPr>
+              <w:t xml:space="preserve">22</w:t>
+            </w:r>
+          </w:p>
+        </w:tc>
+      </w:tr>
+      <w:tr>
+        <w:trPr>
+          <w:cantSplit/>
+        </w:trPr>
+        <w:tc>
+          <w:tcPr>
+            <w:tcW w:type="dxa" w:w="3707"/>
+            <w:tcMar>
+              <w:top w:type="dxa" w:w="30"/>
+              <w:left w:type="dxa" w:w="70"/>
+              <w:bottom w:type="dxa" w:w="30"/>
+              <w:right w:type="dxa" w:w="70"/>
+            </w:tcMar>
+          </w:tcPr>
+          <w:p>
+            <w:pPr>
+              <w:jc w:val="left"/>
+            </w:pPr>
+            <w:r>
+              <w:rPr>
+                <w:sz w:val="15"/>
+                <w:szCs w:val="15"/>
+                <w:rFonts w:ascii="Calibri" w:cs="Calibri" w:eastAsia="Calibri" w:hAnsi="Calibri"/>
+              </w:rPr>
+              <w:t xml:space="preserve">Itaporã</w:t>
+            </w:r>
+          </w:p>
+        </w:tc>
+        <w:tc>
+          <w:tcPr>
+            <w:tcW w:type="dxa" w:w="1171"/>
+            <w:tcMar>
+              <w:top w:type="dxa" w:w="30"/>
+              <w:left w:type="dxa" w:w="70"/>
+              <w:bottom w:type="dxa" w:w="30"/>
+              <w:right w:type="dxa" w:w="70"/>
+            </w:tcMar>
+          </w:tcPr>
+          <w:p>
+            <w:pPr>
+              <w:jc w:val="right"/>
+            </w:pPr>
+            <w:r>
+              <w:rPr>
+                <w:sz w:val="15"/>
+                <w:szCs w:val="15"/>
+                <w:rFonts w:ascii="Calibri" w:cs="Calibri" w:eastAsia="Calibri" w:hAnsi="Calibri"/>
+              </w:rPr>
+              <w:t xml:space="preserve">20</w:t>
+            </w:r>
+          </w:p>
+        </w:tc>
+        <w:tc>
+          <w:tcPr>
+            <w:tcW w:type="dxa" w:w="3707"/>
+            <w:tcMar>
+              <w:top w:type="dxa" w:w="30"/>
+              <w:left w:type="dxa" w:w="70"/>
+              <w:bottom w:type="dxa" w:w="30"/>
+              <w:right w:type="dxa" w:w="70"/>
+            </w:tcMar>
+          </w:tcPr>
+          <w:p>
+            <w:pPr>
+              <w:jc w:val="left"/>
+            </w:pPr>
+          </w:p>
+        </w:tc>
+        <w:tc>
+          <w:tcPr>
+            <w:tcW w:type="dxa" w:w="1171"/>
+            <w:tcMar>
+              <w:top w:type="dxa" w:w="30"/>
+              <w:left w:type="dxa" w:w="70"/>
+              <w:bottom w:type="dxa" w:w="30"/>
+              <w:right w:type="dxa" w:w="70"/>
+            </w:tcMar>
+          </w:tcPr>
+          <w:p>
+            <w:pPr>
+              <w:jc w:val="right"/>
+            </w:pPr>
+          </w:p>
+        </w:tc>
+      </w:tr>
+    </w:tbl>
+    <w:p>
+      <w:pPr>
+        <w:spacing w:after="80" w:before="0"/>
+      </w:pPr>
+    </w:p>
     <w:sectPr>
       <w:headerReference w:type="default" r:id="rId6"/>
       <w:footerReference w:type="default" r:id="rId7"/>

</xml_diff>